<commit_message>
Rapport : page de garde, sommaire, resume, schema d'architecture, pagination, version PDF
Co-Authored-By: Claude Opus 5.5 <noreply@anthropic.com>
</commit_message>
<xml_diff>
--- a/rapport/Rapport_PatchManagement.docx
+++ b/rapport/Rapport_PatchManagement.docx
@@ -7,7 +7,7 @@
         <w:pStyle w:val="Title"/>
       </w:pPr>
       <w:r>
-        <w:t xml:space="preserve">Projet : Système de gestion des mises à jour en PowerShell</w:t>
+        <w:t xml:space="preserve">Système de gestion des mises à jour en PowerShell</w:t>
       </w:r>
     </w:p>
     <w:p>
@@ -15,7 +15,7 @@
         <w:pStyle w:val="Subtitle"/>
       </w:pPr>
       <w:r>
-        <w:t xml:space="preserve">Patch Management Windows — Sécurité des systèmes (S. Benayoune)</w:t>
+        <w:t xml:space="preserve">Projet Patch Management Windows — Sécurité des systèmes</w:t>
       </w:r>
     </w:p>
     <w:p>
@@ -23,7 +23,15 @@
         <w:pStyle w:val="Author"/>
       </w:pPr>
       <w:r>
-        <w:t xml:space="preserve">FEGHOUL Loris et GABOUTY Maxime</w:t>
+        <w:t xml:space="preserve">FEGHOUL Loris</w:t>
+      </w:r>
+    </w:p>
+    <w:p>
+      <w:pPr>
+        <w:pStyle w:val="Author"/>
+      </w:pPr>
+      <w:r>
+        <w:t xml:space="preserve">GABOUTY Maxime</w:t>
       </w:r>
     </w:p>
     <w:p>
@@ -31,35 +39,142 @@
         <w:pStyle w:val="Date"/>
       </w:pPr>
       <w:r>
-        <w:t xml:space="preserve">Octobre 2026</w:t>
-      </w:r>
-    </w:p>
-    <w:sdt>
-      <w:sdtPr>
-        <w:docPartObj>
-          <w:docPartGallery w:val="Table of Contents"/>
-          <w:docPartUnique/>
-        </w:docPartObj>
-      </w:sdtPr>
-      <w:sdtContent>
-        <w:p>
-          <w:pPr>
-            <w:pStyle w:val="TOCHeading"/>
-          </w:pPr>
-          <w:r>
-            <w:t xml:space="preserve">Sommaire</w:t>
-          </w:r>
-        </w:p>
-        <w:p>
-          <w:r>
-            <w:fldChar w:fldCharType="begin" w:dirty="true"/>
-            <w:instrText xml:space="preserve">TOC \o "1-3" \h \z \u</w:instrText>
-            <w:fldChar w:fldCharType="separate"/>
-            <w:fldChar w:fldCharType="end"/>
-          </w:r>
-        </w:p>
-      </w:sdtContent>
-    </w:sdt>
+        <w:t xml:space="preserve">Enseignant : Salim Benayoune — 31 octobre 2026</w:t>
+      </w:r>
+    </w:p>
+    <w:p>
+      <w:r>
+        <w:br w:type="page"/>
+      </w:r>
+    </w:p>
+    <w:p>
+      <w:pPr>
+        <w:pStyle w:val="TOCHeading"/>
+      </w:pPr>
+      <w:r>
+        <w:t>Sommaire</w:t>
+      </w:r>
+    </w:p>
+    <w:p>
+      <w:r>
+        <w:fldChar w:fldCharType="begin" w:dirty="true"/>
+      </w:r>
+      <w:r>
+        <w:instrText xml:space="preserve"> TOC \o "1-2" \h \z \u </w:instrText>
+      </w:r>
+      <w:r>
+        <w:fldChar w:fldCharType="separate"/>
+      </w:r>
+      <w:r>
+        <w:t>Ouvrir dans Word puis accepter la mise à jour des champs (ou clic droit → Mettre à jour les champs) pour afficher le sommaire.</w:t>
+      </w:r>
+      <w:r>
+        <w:fldChar w:fldCharType="end"/>
+      </w:r>
+    </w:p>
+    <w:p>
+      <w:r>
+        <w:br w:type="page"/>
+      </w:r>
+    </w:p>
+    <w:p>
+      <w:pPr>
+        <w:pStyle w:val="FirstParagraph"/>
+      </w:pPr>
+      <w:r>
+        <w:rPr>
+          <w:b/>
+          <w:bCs/>
+        </w:rPr>
+        <w:t xml:space="preserve">Résumé.</w:t>
+      </w:r>
+      <w:r>
+        <w:t xml:space="preserve"> </w:t>
+      </w:r>
+      <w:r>
+        <w:t xml:space="preserve">Ce projet met en œuvre une solution centralisée d’audit des correctifs de sécurité d’un parc Windows en PowerShell. À partir d’un inventaire</w:t>
+      </w:r>
+      <w:r>
+        <w:t xml:space="preserve"> </w:t>
+      </w:r>
+      <w:r>
+        <w:rPr>
+          <w:rStyle w:val="VerbatimChar"/>
+        </w:rPr>
+        <w:t xml:space="preserve">computers.txt</w:t>
+      </w:r>
+      <w:r>
+        <w:t xml:space="preserve">, des scripts testent la disponibilité des postes, interrogent chaque machine à distance par PowerShell Remoting (WinRM), inventorient le système et les correctifs installés, comparent ces correctifs à une politique de KB obligatoires et classent chaque poste</w:t>
+      </w:r>
+      <w:r>
+        <w:t xml:space="preserve"> </w:t>
+      </w:r>
+      <w:r>
+        <w:rPr>
+          <w:b/>
+          <w:bCs/>
+        </w:rPr>
+        <w:t xml:space="preserve">CONFORME</w:t>
+      </w:r>
+      <w:r>
+        <w:t xml:space="preserve">,</w:t>
+      </w:r>
+      <w:r>
+        <w:t xml:space="preserve"> </w:t>
+      </w:r>
+      <w:r>
+        <w:rPr>
+          <w:b/>
+          <w:bCs/>
+        </w:rPr>
+        <w:t xml:space="preserve">NON CONFORME</w:t>
+      </w:r>
+      <w:r>
+        <w:t xml:space="preserve"> </w:t>
+      </w:r>
+      <w:r>
+        <w:t xml:space="preserve">ou</w:t>
+      </w:r>
+      <w:r>
+        <w:t xml:space="preserve"> </w:t>
+      </w:r>
+      <w:r>
+        <w:rPr>
+          <w:b/>
+          <w:bCs/>
+        </w:rPr>
+        <w:t xml:space="preserve">INACCESSIBLE</w:t>
+      </w:r>
+      <w:r>
+        <w:t xml:space="preserve">. Ils produisent des rapports CSV et HTML, un journal d’exécution et une notification à l’administrateur en cas d’anomalie. La solution a été durcie : compte de service non administrateur, point de terminaison</w:t>
+      </w:r>
+      <w:r>
+        <w:t xml:space="preserve"> </w:t>
+      </w:r>
+      <w:r>
+        <w:rPr>
+          <w:b/>
+          <w:bCs/>
+        </w:rPr>
+        <w:t xml:space="preserve">JEA</w:t>
+      </w:r>
+      <w:r>
+        <w:t xml:space="preserve">, pare-feu WinRM restreint au poste d’administration, droits NTFS limités et secrets chiffrés (DPAPI). Elle a été testée sur deux machines virtuelles Windows 11 et un poste inaccessible simulé : 3 postes, 1 conforme, 1 non conforme, 1 inaccessible,</w:t>
+      </w:r>
+      <w:r>
+        <w:t xml:space="preserve"> </w:t>
+      </w:r>
+      <w:r>
+        <w:rPr>
+          <w:b/>
+          <w:bCs/>
+        </w:rPr>
+        <w:t xml:space="preserve">taux de conformité de 50 %</w:t>
+      </w:r>
+      <w:r>
+        <w:t xml:space="preserve">.</w:t>
+      </w:r>
+    </w:p>
     <w:bookmarkStart w:id="9" w:name="introduction"/>
     <w:p>
       <w:pPr>
@@ -163,7 +278,7 @@
       </w:r>
     </w:p>
     <w:bookmarkEnd w:id="9"/>
-    <w:bookmarkStart w:id="13" w:name="environnement-de-test"/>
+    <w:bookmarkStart w:id="16" w:name="environnement-de-test"/>
     <w:p>
       <w:pPr>
         <w:pStyle w:val="Heading1"/>
@@ -172,7 +287,7 @@
         <w:t xml:space="preserve">2. Environnement de test</w:t>
       </w:r>
     </w:p>
-    <w:bookmarkStart w:id="10" w:name="infrastructure"/>
+    <w:bookmarkStart w:id="13" w:name="infrastructure"/>
     <w:p>
       <w:pPr>
         <w:pStyle w:val="Heading2"/>
@@ -511,98 +626,61 @@
     </w:p>
     <w:p>
       <w:pPr>
-        <w:pStyle w:val="SourceCode"/>
-      </w:pPr>
-      <w:r>
-        <w:rPr>
-          <w:rStyle w:val="VerbatimChar"/>
-        </w:rPr>
-        <w:t xml:space="preserve">                 Réseau virtuel 172.16.26.0/24 (NAT VMware Fusion)</w:t>
-      </w:r>
-      <w:r>
-        <w:br/>
-      </w:r>
-      <w:r>
-        <w:rPr>
-          <w:rStyle w:val="VerbatimChar"/>
-        </w:rPr>
-        <w:t xml:space="preserve">   ┌──────────────────────────┐   WinRM HTTP 5985    ┌──────────────────────────┐</w:t>
-      </w:r>
-      <w:r>
-        <w:br/>
-      </w:r>
-      <w:r>
-        <w:rPr>
-          <w:rStyle w:val="VerbatimChar"/>
-        </w:rPr>
-        <w:t xml:space="preserve">   │ PC01  172.16.26.11       │ ───────────────────▶ │ PC02  172.16.26.12       │</w:t>
-      </w:r>
-      <w:r>
-        <w:br/>
-      </w:r>
-      <w:r>
-        <w:rPr>
-          <w:rStyle w:val="VerbatimChar"/>
-        </w:rPr>
-        <w:t xml:space="preserve">   │ Poste d'administration   │   (NTLM, chiffré)    │ Poste supervisé          │</w:t>
-      </w:r>
-      <w:r>
-        <w:br/>
-      </w:r>
-      <w:r>
-        <w:rPr>
-          <w:rStyle w:val="VerbatimChar"/>
-        </w:rPr>
-        <w:t xml:space="preserve">   │ C:\PatchManager          │ ◀─── (bloqué) ─────  │ JEA « PatchAudit »       │</w:t>
-      </w:r>
-      <w:r>
-        <w:br/>
-      </w:r>
-      <w:r>
-        <w:rPr>
-          <w:rStyle w:val="VerbatimChar"/>
-        </w:rPr>
-        <w:t xml:space="preserve">   │ + poste supervisé        │                      │ compte svc-patch         │</w:t>
-      </w:r>
-      <w:r>
-        <w:br/>
-      </w:r>
-      <w:r>
-        <w:rPr>
-          <w:rStyle w:val="VerbatimChar"/>
-        </w:rPr>
-        <w:t xml:space="preserve">   └──────────────────────────┘                      └──────────────────────────┘</w:t>
-      </w:r>
-      <w:r>
-        <w:br/>
-      </w:r>
-      <w:r>
-        <w:rPr>
-          <w:rStyle w:val="VerbatimChar"/>
-        </w:rPr>
-        <w:t xml:space="preserve">            │  ping / Test-WSMan</w:t>
-      </w:r>
-      <w:r>
-        <w:br/>
-      </w:r>
-      <w:r>
-        <w:rPr>
-          <w:rStyle w:val="VerbatimChar"/>
-        </w:rPr>
-        <w:t xml:space="preserve">            ▼</w:t>
-      </w:r>
-      <w:r>
-        <w:br/>
-      </w:r>
-      <w:r>
-        <w:rPr>
-          <w:rStyle w:val="VerbatimChar"/>
-        </w:rPr>
-        <w:t xml:space="preserve">   PC03  172.16.26.13  (aucune machine : poste « INACCESSIBLE »)</w:t>
-      </w:r>
-    </w:p>
-    <w:bookmarkEnd w:id="10"/>
-    <w:bookmarkStart w:id="11" w:name="organisation-du-code"/>
+        <w:pStyle w:val="CaptionedFigure"/>
+      </w:pPr>
+      <w:r>
+        <w:drawing>
+          <wp:inline>
+            <wp:extent cx="5334000" cy="2667000"/>
+            <wp:effectExtent b="0" l="0" r="0" t="0"/>
+            <wp:docPr descr="Architecture de l’environnement de test" title="" id="11" name="Picture"/>
+            <a:graphic>
+              <a:graphicData uri="http://schemas.openxmlformats.org/drawingml/2006/picture">
+                <pic:pic>
+                  <pic:nvPicPr>
+                    <pic:cNvPr descr="architecture.png" id="12" name="Picture"/>
+                    <pic:cNvPicPr>
+                      <a:picLocks noChangeArrowheads="1" noChangeAspect="1"/>
+                    </pic:cNvPicPr>
+                  </pic:nvPicPr>
+                  <pic:blipFill>
+                    <a:blip r:embed="rId10"/>
+                    <a:stretch>
+                      <a:fillRect/>
+                    </a:stretch>
+                  </pic:blipFill>
+                  <pic:spPr bwMode="auto">
+                    <a:xfrm>
+                      <a:off x="0" y="0"/>
+                      <a:ext cx="5334000" cy="2667000"/>
+                    </a:xfrm>
+                    <a:prstGeom prst="rect">
+                      <a:avLst/>
+                    </a:prstGeom>
+                    <a:noFill/>
+                    <a:ln w="9525">
+                      <a:noFill/>
+                      <a:headEnd/>
+                      <a:tailEnd/>
+                    </a:ln>
+                  </pic:spPr>
+                </pic:pic>
+              </a:graphicData>
+            </a:graphic>
+          </wp:inline>
+        </w:drawing>
+      </w:r>
+    </w:p>
+    <w:p>
+      <w:pPr>
+        <w:pStyle w:val="ImageCaption"/>
+      </w:pPr>
+      <w:r>
+        <w:t xml:space="preserve">Architecture de l’environnement de test</w:t>
+      </w:r>
+    </w:p>
+    <w:bookmarkEnd w:id="13"/>
+    <w:bookmarkStart w:id="14" w:name="organisation-du-code"/>
     <w:p>
       <w:pPr>
         <w:pStyle w:val="Heading2"/>
@@ -1371,8 +1449,8 @@
         <w:t xml:space="preserve">.</w:t>
       </w:r>
     </w:p>
-    <w:bookmarkEnd w:id="11"/>
-    <w:bookmarkStart w:id="12" w:name="choix-techniques"/>
+    <w:bookmarkEnd w:id="14"/>
+    <w:bookmarkStart w:id="15" w:name="choix-techniques"/>
     <w:p>
       <w:pPr>
         <w:pStyle w:val="Heading2"/>
@@ -1683,9 +1761,9 @@
         <w:t xml:space="preserve">: scripts enregistrés en UTF-8 avec BOM pour que Windows PowerShell 5.1 affiche correctement les accents.</w:t>
       </w:r>
     </w:p>
-    <w:bookmarkEnd w:id="12"/>
-    <w:bookmarkEnd w:id="13"/>
-    <w:bookmarkStart w:id="51" w:name="partie-1-préparation-de-lenvironnement"/>
+    <w:bookmarkEnd w:id="15"/>
+    <w:bookmarkEnd w:id="16"/>
+    <w:bookmarkStart w:id="54" w:name="partie-1-préparation-de-lenvironnement"/>
     <w:p>
       <w:pPr>
         <w:pStyle w:val="Heading1"/>
@@ -1694,7 +1772,7 @@
         <w:t xml:space="preserve">3. Partie 1 — Préparation de l’environnement</w:t>
       </w:r>
     </w:p>
-    <w:bookmarkStart w:id="17" w:name="connectivité-entre-les-postes-q1"/>
+    <w:bookmarkStart w:id="20" w:name="connectivité-entre-les-postes-q1"/>
     <w:p>
       <w:pPr>
         <w:pStyle w:val="Heading2"/>
@@ -1745,18 +1823,18 @@
           <wp:inline>
             <wp:extent cx="5334000" cy="1979717"/>
             <wp:effectExtent b="0" l="0" r="0" t="0"/>
-            <wp:docPr descr="Connectivité entre PC01 et PC02 (Test-Connection)" title="" id="15" name="Picture"/>
+            <wp:docPr descr="Connectivité entre PC01 et PC02 (Test-Connection)" title="" id="18" name="Picture"/>
             <a:graphic>
               <a:graphicData uri="http://schemas.openxmlformats.org/drawingml/2006/picture">
                 <pic:pic>
                   <pic:nvPicPr>
-                    <pic:cNvPr descr="../screenshots/P1-1_connectivite.jpg" id="16" name="Picture"/>
+                    <pic:cNvPr descr="../screenshots/P1-1_connectivite.jpg" id="19" name="Picture"/>
                     <pic:cNvPicPr>
                       <a:picLocks noChangeArrowheads="1" noChangeAspect="1"/>
                     </pic:cNvPicPr>
                   </pic:nvPicPr>
                   <pic:blipFill>
-                    <a:blip r:embed="rId14"/>
+                    <a:blip r:embed="rId17"/>
                     <a:stretch>
                       <a:fillRect/>
                     </a:stretch>
@@ -1791,8 +1869,8 @@
         <w:t xml:space="preserve">Connectivité entre PC01 et PC02 (Test-Connection)</w:t>
       </w:r>
     </w:p>
-    <w:bookmarkEnd w:id="17"/>
-    <w:bookmarkStart w:id="21" w:name="Xe84f2ac2f0c804abd880fb184b8818a27e99ac2"/>
+    <w:bookmarkEnd w:id="20"/>
+    <w:bookmarkStart w:id="24" w:name="Xe84f2ac2f0c804abd880fb184b8818a27e99ac2"/>
     <w:p>
       <w:pPr>
         <w:pStyle w:val="Heading2"/>
@@ -1885,18 +1963,18 @@
           <wp:inline>
             <wp:extent cx="5334000" cy="1906235"/>
             <wp:effectExtent b="0" l="0" r="0" t="0"/>
-            <wp:docPr descr="computers.txt et résultat de 01-Test-Environment.ps1" title="" id="19" name="Picture"/>
+            <wp:docPr descr="computers.txt et résultat de 01-Test-Environment.ps1" title="" id="22" name="Picture"/>
             <a:graphic>
               <a:graphicData uri="http://schemas.openxmlformats.org/drawingml/2006/picture">
                 <pic:pic>
                   <pic:nvPicPr>
-                    <pic:cNvPr descr="../screenshots/P1-2-3_computers-txt_disponibilite.jpg" id="20" name="Picture"/>
+                    <pic:cNvPr descr="../screenshots/P1-2-3_computers-txt_disponibilite.jpg" id="23" name="Picture"/>
                     <pic:cNvPicPr>
                       <a:picLocks noChangeArrowheads="1" noChangeAspect="1"/>
                     </pic:cNvPicPr>
                   </pic:nvPicPr>
                   <pic:blipFill>
-                    <a:blip r:embed="rId18"/>
+                    <a:blip r:embed="rId21"/>
                     <a:stretch>
                       <a:fillRect/>
                     </a:stretch>
@@ -1931,8 +2009,8 @@
         <w:t xml:space="preserve">computers.txt et résultat de 01-Test-Environment.ps1</w:t>
       </w:r>
     </w:p>
-    <w:bookmarkEnd w:id="21"/>
-    <w:bookmarkStart w:id="25" w:name="Xdaceeeda3c0f7433809a1cb741dc8e3d0f6a715"/>
+    <w:bookmarkEnd w:id="24"/>
+    <w:bookmarkStart w:id="28" w:name="Xdaceeeda3c0f7433809a1cb741dc8e3d0f6a715"/>
     <w:p>
       <w:pPr>
         <w:pStyle w:val="Heading2"/>
@@ -2016,18 +2094,18 @@
           <wp:inline>
             <wp:extent cx="5334000" cy="1667111"/>
             <wp:effectExtent b="0" l="0" r="0" t="0"/>
-            <wp:docPr descr="Service WinRM, écouteur et Test-WSMan" title="" id="23" name="Picture"/>
+            <wp:docPr descr="Service WinRM, écouteur et Test-WSMan" title="" id="26" name="Picture"/>
             <a:graphic>
               <a:graphicData uri="http://schemas.openxmlformats.org/drawingml/2006/picture">
                 <pic:pic>
                   <pic:nvPicPr>
-                    <pic:cNvPr descr="../screenshots/P1-4_WinRM-Test-WSMan.jpg" id="24" name="Picture"/>
+                    <pic:cNvPr descr="../screenshots/P1-4_WinRM-Test-WSMan.jpg" id="27" name="Picture"/>
                     <pic:cNvPicPr>
                       <a:picLocks noChangeArrowheads="1" noChangeAspect="1"/>
                     </pic:cNvPicPr>
                   </pic:nvPicPr>
                   <pic:blipFill>
-                    <a:blip r:embed="rId22"/>
+                    <a:blip r:embed="rId25"/>
                     <a:stretch>
                       <a:fillRect/>
                     </a:stretch>
@@ -2062,8 +2140,8 @@
         <w:t xml:space="preserve">Service WinRM, écouteur et Test-WSMan</w:t>
       </w:r>
     </w:p>
-    <w:bookmarkEnd w:id="25"/>
-    <w:bookmarkStart w:id="29" w:name="session-interactive-enter-pssession-q5"/>
+    <w:bookmarkEnd w:id="28"/>
+    <w:bookmarkStart w:id="32" w:name="session-interactive-enter-pssession-q5"/>
     <w:p>
       <w:pPr>
         <w:pStyle w:val="Heading2"/>
@@ -2153,18 +2231,18 @@
           <wp:inline>
             <wp:extent cx="5334000" cy="2471334"/>
             <wp:effectExtent b="0" l="0" r="0" t="0"/>
-            <wp:docPr descr="Commandes exécutées dans une session Enter-PSSession sur PC02" title="" id="27" name="Picture"/>
+            <wp:docPr descr="Commandes exécutées dans une session Enter-PSSession sur PC02" title="" id="30" name="Picture"/>
             <a:graphic>
               <a:graphicData uri="http://schemas.openxmlformats.org/drawingml/2006/picture">
                 <pic:pic>
                   <pic:nvPicPr>
-                    <pic:cNvPr descr="../screenshots/P1-5_Enter-PSSession.jpg" id="28" name="Picture"/>
+                    <pic:cNvPr descr="../screenshots/P1-5_Enter-PSSession.jpg" id="31" name="Picture"/>
                     <pic:cNvPicPr>
                       <a:picLocks noChangeArrowheads="1" noChangeAspect="1"/>
                     </pic:cNvPicPr>
                   </pic:nvPicPr>
                   <pic:blipFill>
-                    <a:blip r:embed="rId26"/>
+                    <a:blip r:embed="rId29"/>
                     <a:stretch>
                       <a:fillRect/>
                     </a:stretch>
@@ -2199,8 +2277,8 @@
         <w:t xml:space="preserve">Commandes exécutées dans une session Enter-PSSession sur PC02</w:t>
       </w:r>
     </w:p>
-    <w:bookmarkEnd w:id="29"/>
-    <w:bookmarkStart w:id="33" w:name="X56d4623f3e1e1389cf82821dd20af7a6b49b111"/>
+    <w:bookmarkEnd w:id="32"/>
+    <w:bookmarkStart w:id="36" w:name="X56d4623f3e1e1389cf82821dd20af7a6b49b111"/>
     <w:p>
       <w:pPr>
         <w:pStyle w:val="Heading2"/>
@@ -2263,18 +2341,18 @@
           <wp:inline>
             <wp:extent cx="5334000" cy="873248"/>
             <wp:effectExtent b="0" l="0" r="0" t="0"/>
-            <wp:docPr descr="Invoke-Command sur les deux postes en une commande" title="" id="31" name="Picture"/>
+            <wp:docPr descr="Invoke-Command sur les deux postes en une commande" title="" id="34" name="Picture"/>
             <a:graphic>
               <a:graphicData uri="http://schemas.openxmlformats.org/drawingml/2006/picture">
                 <pic:pic>
                   <pic:nvPicPr>
-                    <pic:cNvPr descr="../screenshots/P1-6_Invoke-Command.jpg" id="32" name="Picture"/>
+                    <pic:cNvPr descr="../screenshots/P1-6_Invoke-Command.jpg" id="35" name="Picture"/>
                     <pic:cNvPicPr>
                       <a:picLocks noChangeArrowheads="1" noChangeAspect="1"/>
                     </pic:cNvPicPr>
                   </pic:nvPicPr>
                   <pic:blipFill>
-                    <a:blip r:embed="rId30"/>
+                    <a:blip r:embed="rId33"/>
                     <a:stretch>
                       <a:fillRect/>
                     </a:stretch>
@@ -2309,8 +2387,8 @@
         <w:t xml:space="preserve">Invoke-Command sur les deux postes en une commande</w:t>
       </w:r>
     </w:p>
-    <w:bookmarkEnd w:id="33"/>
-    <w:bookmarkStart w:id="49" w:name="X04d1c6b906a5cb21d5fa1b89e4c71aab570b8eb"/>
+    <w:bookmarkEnd w:id="36"/>
+    <w:bookmarkStart w:id="52" w:name="X04d1c6b906a5cb21d5fa1b89e4c71aab570b8eb"/>
     <w:p>
       <w:pPr>
         <w:pStyle w:val="Heading2"/>
@@ -2352,18 +2430,18 @@
           <wp:inline>
             <wp:extent cx="5334000" cy="699355"/>
             <wp:effectExtent b="0" l="0" r="0" t="0"/>
-            <wp:docPr descr="Accès refusé vers PC02, OK vers PC01" title="" id="35" name="Picture"/>
+            <wp:docPr descr="Accès refusé vers PC02, OK vers PC01" title="" id="38" name="Picture"/>
             <a:graphic>
               <a:graphicData uri="http://schemas.openxmlformats.org/drawingml/2006/picture">
                 <pic:pic>
                   <pic:nvPicPr>
-                    <pic:cNvPr descr="../screenshots/DEPANNAGE-00_acces-refuse-PC02.jpg" id="36" name="Picture"/>
+                    <pic:cNvPr descr="../screenshots/DEPANNAGE-00_acces-refuse-PC02.jpg" id="39" name="Picture"/>
                     <pic:cNvPicPr>
                       <a:picLocks noChangeArrowheads="1" noChangeAspect="1"/>
                     </pic:cNvPicPr>
                   </pic:nvPicPr>
                   <pic:blipFill>
-                    <a:blip r:embed="rId34"/>
+                    <a:blip r:embed="rId37"/>
                     <a:stretch>
                       <a:fillRect/>
                     </a:stretch>
@@ -2463,18 +2541,18 @@
           <wp:inline>
             <wp:extent cx="5334000" cy="1994933"/>
             <wp:effectExtent b="0" l="0" r="0" t="0"/>
-            <wp:docPr descr="Événements 4625 sur PC02" title="" id="38" name="Picture"/>
+            <wp:docPr descr="Événements 4625 sur PC02" title="" id="41" name="Picture"/>
             <a:graphic>
               <a:graphicData uri="http://schemas.openxmlformats.org/drawingml/2006/picture">
                 <pic:pic>
                   <pic:nvPicPr>
-                    <pic:cNvPr descr="../screenshots/DEPANNAGE-0_event4625-0xC000006D.jpg" id="39" name="Picture"/>
+                    <pic:cNvPr descr="../screenshots/DEPANNAGE-0_event4625-0xC000006D.jpg" id="42" name="Picture"/>
                     <pic:cNvPicPr>
                       <a:picLocks noChangeArrowheads="1" noChangeAspect="1"/>
                     </pic:cNvPicPr>
                   </pic:nvPicPr>
                   <pic:blipFill>
-                    <a:blip r:embed="rId37"/>
+                    <a:blip r:embed="rId40"/>
                     <a:stretch>
                       <a:fillRect/>
                     </a:stretch>
@@ -2572,18 +2650,18 @@
           <wp:inline>
             <wp:extent cx="5334000" cy="704398"/>
             <wp:effectExtent b="0" l="0" r="0" t="0"/>
-            <wp:docPr descr="SID identique sur PC02…" title="" id="41" name="Picture"/>
+            <wp:docPr descr="SID identique sur PC02…" title="" id="44" name="Picture"/>
             <a:graphic>
               <a:graphicData uri="http://schemas.openxmlformats.org/drawingml/2006/picture">
                 <pic:pic>
                   <pic:nvPicPr>
-                    <pic:cNvPr descr="../screenshots/DEPANNAGE-1_SID-PC02.jpg" id="42" name="Picture"/>
+                    <pic:cNvPr descr="../screenshots/DEPANNAGE-1_SID-PC02.jpg" id="45" name="Picture"/>
                     <pic:cNvPicPr>
                       <a:picLocks noChangeArrowheads="1" noChangeAspect="1"/>
                     </pic:cNvPicPr>
                   </pic:nvPicPr>
                   <pic:blipFill>
-                    <a:blip r:embed="rId40"/>
+                    <a:blip r:embed="rId43"/>
                     <a:stretch>
                       <a:fillRect/>
                     </a:stretch>
@@ -2627,18 +2705,18 @@
           <wp:inline>
             <wp:extent cx="5334000" cy="427497"/>
             <wp:effectExtent b="0" l="0" r="0" t="0"/>
-            <wp:docPr descr="…et sur PC01" title="" id="44" name="Picture"/>
+            <wp:docPr descr="…et sur PC01" title="" id="47" name="Picture"/>
             <a:graphic>
               <a:graphicData uri="http://schemas.openxmlformats.org/drawingml/2006/picture">
                 <pic:pic>
                   <pic:nvPicPr>
-                    <pic:cNvPr descr="../screenshots/DEPANNAGE-2_SID-PC01.jpg" id="45" name="Picture"/>
+                    <pic:cNvPr descr="../screenshots/DEPANNAGE-2_SID-PC01.jpg" id="48" name="Picture"/>
                     <pic:cNvPicPr>
                       <a:picLocks noChangeArrowheads="1" noChangeAspect="1"/>
                     </pic:cNvPicPr>
                   </pic:nvPicPr>
                   <pic:blipFill>
-                    <a:blip r:embed="rId43"/>
+                    <a:blip r:embed="rId46"/>
                     <a:stretch>
                       <a:fillRect/>
                     </a:stretch>
@@ -2702,18 +2780,18 @@
           <wp:inline>
             <wp:extent cx="5334000" cy="464976"/>
             <wp:effectExtent b="0" l="0" r="0" t="0"/>
-            <wp:docPr descr="Après Sysprep : SID différents, accès OK" title="" id="47" name="Picture"/>
+            <wp:docPr descr="Après Sysprep : SID différents, accès OK" title="" id="50" name="Picture"/>
             <a:graphic>
               <a:graphicData uri="http://schemas.openxmlformats.org/drawingml/2006/picture">
                 <pic:pic>
                   <pic:nvPicPr>
-                    <pic:cNvPr descr="../screenshots/DEPANNAGE-3_resolu-apres-sysprep.jpg" id="48" name="Picture"/>
+                    <pic:cNvPr descr="../screenshots/DEPANNAGE-3_resolu-apres-sysprep.jpg" id="51" name="Picture"/>
                     <pic:cNvPicPr>
                       <a:picLocks noChangeArrowheads="1" noChangeAspect="1"/>
                     </pic:cNvPicPr>
                   </pic:nvPicPr>
                   <pic:blipFill>
-                    <a:blip r:embed="rId46"/>
+                    <a:blip r:embed="rId49"/>
                     <a:stretch>
                       <a:fillRect/>
                     </a:stretch>
@@ -2766,8 +2844,8 @@
         <w:t xml:space="preserve">: on ne déploie jamais un clone Windows sans Sysprep ; c’est la procédure normale de préparation d’une image (master).</w:t>
       </w:r>
     </w:p>
-    <w:bookmarkEnd w:id="49"/>
-    <w:bookmarkStart w:id="50" w:name="réponses-aux-questions-de-la-partie-1"/>
+    <w:bookmarkEnd w:id="52"/>
+    <w:bookmarkStart w:id="53" w:name="réponses-aux-questions-de-la-partie-1"/>
     <w:p>
       <w:pPr>
         <w:pStyle w:val="Heading2"/>
@@ -3127,9 +3205,9 @@
         <w:t xml:space="preserve">désactive la vérification de l’identité des serveurs ; des méthodes faibles (Basic, trafic non chiffré) exposent les mots de passe ; un compte d’administration unique utilisé partout devient une cible de choix ; et sans journalisation, les actions ne sont pas traçables. Ces risques sont traités en partie 7.</w:t>
       </w:r>
     </w:p>
-    <w:bookmarkEnd w:id="50"/>
-    <w:bookmarkEnd w:id="51"/>
-    <w:bookmarkStart w:id="58" w:name="partie-2-inventaire-du-parc"/>
+    <w:bookmarkEnd w:id="53"/>
+    <w:bookmarkEnd w:id="54"/>
+    <w:bookmarkStart w:id="61" w:name="partie-2-inventaire-du-parc"/>
     <w:p>
       <w:pPr>
         <w:pStyle w:val="Heading1"/>
@@ -3216,18 +3294,18 @@
           <wp:inline>
             <wp:extent cx="5334000" cy="1088725"/>
             <wp:effectExtent b="0" l="0" r="0" t="0"/>
-            <wp:docPr descr="Tableau récapitulatif de l’inventaire" title="" id="53" name="Picture"/>
+            <wp:docPr descr="Tableau récapitulatif de l’inventaire" title="" id="56" name="Picture"/>
             <a:graphic>
               <a:graphicData uri="http://schemas.openxmlformats.org/drawingml/2006/picture">
                 <pic:pic>
                   <pic:nvPicPr>
-                    <pic:cNvPr descr="../screenshots/P2-1_inventaire-tableau.jpg" id="54" name="Picture"/>
+                    <pic:cNvPr descr="../screenshots/P2-1_inventaire-tableau.jpg" id="57" name="Picture"/>
                     <pic:cNvPicPr>
                       <a:picLocks noChangeArrowheads="1" noChangeAspect="1"/>
                     </pic:cNvPicPr>
                   </pic:nvPicPr>
                   <pic:blipFill>
-                    <a:blip r:embed="rId52"/>
+                    <a:blip r:embed="rId55"/>
                     <a:stretch>
                       <a:fillRect/>
                     </a:stretch>
@@ -3310,18 +3388,18 @@
           <wp:inline>
             <wp:extent cx="5334000" cy="4147704"/>
             <wp:effectExtent b="0" l="0" r="0" t="0"/>
-            <wp:docPr descr="Détail de Inventory.csv" title="" id="56" name="Picture"/>
+            <wp:docPr descr="Détail de Inventory.csv" title="" id="59" name="Picture"/>
             <a:graphic>
               <a:graphicData uri="http://schemas.openxmlformats.org/drawingml/2006/picture">
                 <pic:pic>
                   <pic:nvPicPr>
-                    <pic:cNvPr descr="../screenshots/P2-2_inventaire-detail-csv.jpg" id="57" name="Picture"/>
+                    <pic:cNvPr descr="../screenshots/P2-2_inventaire-detail-csv.jpg" id="60" name="Picture"/>
                     <pic:cNvPicPr>
                       <a:picLocks noChangeArrowheads="1" noChangeAspect="1"/>
                     </pic:cNvPicPr>
                   </pic:nvPicPr>
                   <pic:blipFill>
-                    <a:blip r:embed="rId55"/>
+                    <a:blip r:embed="rId58"/>
                     <a:stretch>
                       <a:fillRect/>
                     </a:stretch>
@@ -3364,8 +3442,8 @@
         <w:t xml:space="preserve">Remarque : les VM étant sous VMware sur Apple Silicon, le modèle remonte « VMware20,1 » et l’architecture « Processeur ARM 64 bits ».</w:t>
       </w:r>
     </w:p>
-    <w:bookmarkEnd w:id="58"/>
-    <w:bookmarkStart w:id="65" w:name="partie-3-inventaire-des-correctifs"/>
+    <w:bookmarkEnd w:id="61"/>
+    <w:bookmarkStart w:id="68" w:name="partie-3-inventaire-des-correctifs"/>
     <w:p>
       <w:pPr>
         <w:pStyle w:val="Heading1"/>
@@ -3449,18 +3527,18 @@
           <wp:inline>
             <wp:extent cx="5334000" cy="2561544"/>
             <wp:effectExtent b="0" l="0" r="0" t="0"/>
-            <wp:docPr descr="Correctifs locaux et synthèse par poste" title="" id="60" name="Picture"/>
+            <wp:docPr descr="Correctifs locaux et synthèse par poste" title="" id="63" name="Picture"/>
             <a:graphic>
               <a:graphicData uri="http://schemas.openxmlformats.org/drawingml/2006/picture">
                 <pic:pic>
                   <pic:nvPicPr>
-                    <pic:cNvPr descr="../screenshots/P3-1_correctifs-local-et-synthese.jpg" id="61" name="Picture"/>
+                    <pic:cNvPr descr="../screenshots/P3-1_correctifs-local-et-synthese.jpg" id="64" name="Picture"/>
                     <pic:cNvPicPr>
                       <a:picLocks noChangeArrowheads="1" noChangeAspect="1"/>
                     </pic:cNvPicPr>
                   </pic:nvPicPr>
                   <pic:blipFill>
-                    <a:blip r:embed="rId59"/>
+                    <a:blip r:embed="rId62"/>
                     <a:stretch>
                       <a:fillRect/>
                     </a:stretch>
@@ -3571,18 +3649,18 @@
           <wp:inline>
             <wp:extent cx="5334000" cy="1922008"/>
             <wp:effectExtent b="0" l="0" r="0" t="0"/>
-            <wp:docPr descr="PatchesInventory.csv et PatchSummary.csv" title="" id="63" name="Picture"/>
+            <wp:docPr descr="PatchesInventory.csv et PatchSummary.csv" title="" id="66" name="Picture"/>
             <a:graphic>
               <a:graphicData uri="http://schemas.openxmlformats.org/drawingml/2006/picture">
                 <pic:pic>
                   <pic:nvPicPr>
-                    <pic:cNvPr descr="../screenshots/P3-2_PatchesInventory-csv.jpg" id="64" name="Picture"/>
+                    <pic:cNvPr descr="../screenshots/P3-2_PatchesInventory-csv.jpg" id="67" name="Picture"/>
                     <pic:cNvPicPr>
                       <a:picLocks noChangeArrowheads="1" noChangeAspect="1"/>
                     </pic:cNvPicPr>
                   </pic:nvPicPr>
                   <pic:blipFill>
-                    <a:blip r:embed="rId62"/>
+                    <a:blip r:embed="rId65"/>
                     <a:stretch>
                       <a:fillRect/>
                     </a:stretch>
@@ -3641,8 +3719,8 @@
         <w:t xml:space="preserve">: PC02 l’a reçue lors de sa réinstallation (phase OOBE après Sysprep), tandis que sur PC01 l’installation lancée depuis Windows Update n’était pas encore terminée au moment de l’audit. Ce décalage réel entre deux postes est exactement le type de situation que le Patch Management doit détecter.</w:t>
       </w:r>
     </w:p>
-    <w:bookmarkEnd w:id="65"/>
-    <w:bookmarkStart w:id="69" w:name="partie-4-contrôle-de-conformité"/>
+    <w:bookmarkEnd w:id="68"/>
+    <w:bookmarkStart w:id="72" w:name="partie-4-contrôle-de-conformité"/>
     <w:p>
       <w:pPr>
         <w:pStyle w:val="Heading1"/>
@@ -3840,18 +3918,18 @@
           <wp:inline>
             <wp:extent cx="5334000" cy="1922008"/>
             <wp:effectExtent b="0" l="0" r="0" t="0"/>
-            <wp:docPr descr="required-patches.txt et contrôle de conformité" title="" id="67" name="Picture"/>
+            <wp:docPr descr="required-patches.txt et contrôle de conformité" title="" id="70" name="Picture"/>
             <a:graphic>
               <a:graphicData uri="http://schemas.openxmlformats.org/drawingml/2006/picture">
                 <pic:pic>
                   <pic:nvPicPr>
-                    <pic:cNvPr descr="../screenshots/P4_conformite.jpg" id="68" name="Picture"/>
+                    <pic:cNvPr descr="../screenshots/P4_conformite.jpg" id="71" name="Picture"/>
                     <pic:cNvPicPr>
                       <a:picLocks noChangeArrowheads="1" noChangeAspect="1"/>
                     </pic:cNvPicPr>
                   </pic:nvPicPr>
                   <pic:blipFill>
-                    <a:blip r:embed="rId66"/>
+                    <a:blip r:embed="rId69"/>
                     <a:stretch>
                       <a:fillRect/>
                     </a:stretch>
@@ -3946,8 +4024,8 @@
         <w:t xml:space="preserve">: un poste « conforme » à une liste périmée peut rester vulnérable. Ici, la politique a d’ailleurs été mise à jour le 27/10 pour inclure la cumulative d’octobre, ce qui a rendu PC01 non conforme.</w:t>
       </w:r>
     </w:p>
-    <w:bookmarkEnd w:id="69"/>
-    <w:bookmarkStart w:id="79" w:name="partie-5-rapport-de-sécurité"/>
+    <w:bookmarkEnd w:id="72"/>
+    <w:bookmarkStart w:id="82" w:name="partie-5-rapport-de-sécurité"/>
     <w:p>
       <w:pPr>
         <w:pStyle w:val="Heading1"/>
@@ -4025,18 +4103,18 @@
           <wp:inline>
             <wp:extent cx="5334000" cy="2241776"/>
             <wp:effectExtent b="0" l="0" r="0" t="0"/>
-            <wp:docPr descr="Génération du rapport et journal" title="" id="71" name="Picture"/>
+            <wp:docPr descr="Génération du rapport et journal" title="" id="74" name="Picture"/>
             <a:graphic>
               <a:graphicData uri="http://schemas.openxmlformats.org/drawingml/2006/picture">
                 <pic:pic>
                   <pic:nvPicPr>
-                    <pic:cNvPr descr="../screenshots/P5-1_rapport-et-journal.jpg" id="72" name="Picture"/>
+                    <pic:cNvPr descr="../screenshots/P5-1_rapport-et-journal.jpg" id="75" name="Picture"/>
                     <pic:cNvPicPr>
                       <a:picLocks noChangeArrowheads="1" noChangeAspect="1"/>
                     </pic:cNvPicPr>
                   </pic:nvPicPr>
                   <pic:blipFill>
-                    <a:blip r:embed="rId70"/>
+                    <a:blip r:embed="rId73"/>
                     <a:stretch>
                       <a:fillRect/>
                     </a:stretch>
@@ -4113,18 +4191,18 @@
           <wp:inline>
             <wp:extent cx="5334000" cy="2333625"/>
             <wp:effectExtent b="0" l="0" r="0" t="0"/>
-            <wp:docPr descr="Rapport HTML dans Microsoft Edge" title="" id="74" name="Picture"/>
+            <wp:docPr descr="Rapport HTML dans Microsoft Edge" title="" id="77" name="Picture"/>
             <a:graphic>
               <a:graphicData uri="http://schemas.openxmlformats.org/drawingml/2006/picture">
                 <pic:pic>
                   <pic:nvPicPr>
-                    <pic:cNvPr descr="../screenshots/P5-2_rapport-HTML.jpg" id="75" name="Picture"/>
+                    <pic:cNvPr descr="../screenshots/P5-2_rapport-HTML.jpg" id="78" name="Picture"/>
                     <pic:cNvPicPr>
                       <a:picLocks noChangeArrowheads="1" noChangeAspect="1"/>
                     </pic:cNvPicPr>
                   </pic:nvPicPr>
                   <pic:blipFill>
-                    <a:blip r:embed="rId73"/>
+                    <a:blip r:embed="rId76"/>
                     <a:stretch>
                       <a:fillRect/>
                     </a:stretch>
@@ -4215,18 +4293,18 @@
           <wp:inline>
             <wp:extent cx="5334000" cy="1813151"/>
             <wp:effectExtent b="0" l="0" r="0" t="0"/>
-            <wp:docPr descr="Journal d’un audit complet, du début à la fin" title="" id="77" name="Picture"/>
+            <wp:docPr descr="Journal d’un audit complet, du début à la fin" title="" id="80" name="Picture"/>
             <a:graphic>
               <a:graphicData uri="http://schemas.openxmlformats.org/drawingml/2006/picture">
                 <pic:pic>
                   <pic:nvPicPr>
-                    <pic:cNvPr descr="../screenshots/P5-3_journal-audit-complet.jpg" id="78" name="Picture"/>
+                    <pic:cNvPr descr="../screenshots/P5-3_journal-audit-complet.jpg" id="81" name="Picture"/>
                     <pic:cNvPicPr>
                       <a:picLocks noChangeArrowheads="1" noChangeAspect="1"/>
                     </pic:cNvPicPr>
                   </pic:nvPicPr>
                   <pic:blipFill>
-                    <a:blip r:embed="rId76"/>
+                    <a:blip r:embed="rId79"/>
                     <a:stretch>
                       <a:fillRect/>
                     </a:stretch>
@@ -4323,8 +4401,8 @@
         <w:t xml:space="preserve">était appelé avec une syntaxe invalide pour la somme des KB manquantes.</w:t>
       </w:r>
     </w:p>
-    <w:bookmarkEnd w:id="79"/>
-    <w:bookmarkStart w:id="89" w:name="partie-6-notification"/>
+    <w:bookmarkEnd w:id="82"/>
+    <w:bookmarkStart w:id="92" w:name="partie-6-notification"/>
     <w:p>
       <w:pPr>
         <w:pStyle w:val="Heading1"/>
@@ -4520,18 +4598,18 @@
           <wp:inline>
             <wp:extent cx="5334000" cy="853848"/>
             <wp:effectExtent b="0" l="0" r="0" t="0"/>
-            <wp:docPr descr="Échec d’envoi tracé dans le journal" title="" id="81" name="Picture"/>
+            <wp:docPr descr="Échec d’envoi tracé dans le journal" title="" id="84" name="Picture"/>
             <a:graphic>
               <a:graphicData uri="http://schemas.openxmlformats.org/drawingml/2006/picture">
                 <pic:pic>
                   <pic:nvPicPr>
-                    <pic:cNvPr descr="../screenshots/P6-2_notification-echec-journal.jpg" id="82" name="Picture"/>
+                    <pic:cNvPr descr="../screenshots/P6-2_notification-echec-journal.jpg" id="85" name="Picture"/>
                     <pic:cNvPicPr>
                       <a:picLocks noChangeArrowheads="1" noChangeAspect="1"/>
                     </pic:cNvPicPr>
                   </pic:nvPicPr>
                   <pic:blipFill>
-                    <a:blip r:embed="rId80"/>
+                    <a:blip r:embed="rId83"/>
                     <a:stretch>
                       <a:fillRect/>
                     </a:stretch>
@@ -4608,18 +4686,18 @@
           <wp:inline>
             <wp:extent cx="5334000" cy="604847"/>
             <wp:effectExtent b="0" l="0" r="0" t="0"/>
-            <wp:docPr descr="Message reçu par le serveur SMTP de test" title="" id="84" name="Picture"/>
+            <wp:docPr descr="Message reçu par le serveur SMTP de test" title="" id="87" name="Picture"/>
             <a:graphic>
               <a:graphicData uri="http://schemas.openxmlformats.org/drawingml/2006/picture">
                 <pic:pic>
                   <pic:nvPicPr>
-                    <pic:cNvPr descr="../screenshots/P6-3_serveur-SMTP-test-message-recu.jpg" id="85" name="Picture"/>
+                    <pic:cNvPr descr="../screenshots/P6-3_serveur-SMTP-test-message-recu.jpg" id="88" name="Picture"/>
                     <pic:cNvPicPr>
                       <a:picLocks noChangeArrowheads="1" noChangeAspect="1"/>
                     </pic:cNvPicPr>
                   </pic:nvPicPr>
                   <pic:blipFill>
-                    <a:blip r:embed="rId83"/>
+                    <a:blip r:embed="rId86"/>
                     <a:stretch>
                       <a:fillRect/>
                     </a:stretch>
@@ -4663,18 +4741,18 @@
           <wp:inline>
             <wp:extent cx="5334000" cy="2132919"/>
             <wp:effectExtent b="0" l="0" r="0" t="0"/>
-            <wp:docPr descr="Contenu du message reçu (objet, détail, pièce jointe)" title="" id="87" name="Picture"/>
+            <wp:docPr descr="Contenu du message reçu (objet, détail, pièce jointe)" title="" id="90" name="Picture"/>
             <a:graphic>
               <a:graphicData uri="http://schemas.openxmlformats.org/drawingml/2006/picture">
                 <pic:pic>
                   <pic:nvPicPr>
-                    <pic:cNvPr descr="../screenshots/P6-1_contenu-notification.jpg" id="88" name="Picture"/>
+                    <pic:cNvPr descr="../screenshots/P6-1_contenu-notification.jpg" id="91" name="Picture"/>
                     <pic:cNvPicPr>
                       <a:picLocks noChangeArrowheads="1" noChangeAspect="1"/>
                     </pic:cNvPicPr>
                   </pic:nvPicPr>
                   <pic:blipFill>
-                    <a:blip r:embed="rId86"/>
+                    <a:blip r:embed="rId89"/>
                     <a:stretch>
                       <a:fillRect/>
                     </a:stretch>
@@ -5054,8 +5132,8 @@
         <w:t xml:space="preserve">, Azure Key Vault) plutôt que dans un fichier.</w:t>
       </w:r>
     </w:p>
-    <w:bookmarkEnd w:id="89"/>
-    <w:bookmarkStart w:id="125" w:name="partie-7-sécurisation-de-la-solution"/>
+    <w:bookmarkEnd w:id="92"/>
+    <w:bookmarkStart w:id="128" w:name="partie-7-sécurisation-de-la-solution"/>
     <w:p>
       <w:pPr>
         <w:pStyle w:val="Heading1"/>
@@ -5064,7 +5142,7 @@
         <w:t xml:space="preserve">9. Partie 7 — Sécurisation de la solution</w:t>
       </w:r>
     </w:p>
-    <w:bookmarkStart w:id="90" w:name="X303769c0b63f3283938e5e709992a9f46145e86"/>
+    <w:bookmarkStart w:id="93" w:name="X303769c0b63f3283938e5e709992a9f46145e86"/>
     <w:p>
       <w:pPr>
         <w:pStyle w:val="Heading2"/>
@@ -5307,8 +5385,8 @@
         </w:tc>
       </w:tr>
     </w:tbl>
-    <w:bookmarkEnd w:id="90"/>
-    <w:bookmarkStart w:id="94" w:name="qui-peut-ouvrir-une-session-distante-q2"/>
+    <w:bookmarkEnd w:id="93"/>
+    <w:bookmarkStart w:id="97" w:name="qui-peut-ouvrir-une-session-distante-q2"/>
     <w:p>
       <w:pPr>
         <w:pStyle w:val="Heading2"/>
@@ -5435,18 +5513,18 @@
           <wp:inline>
             <wp:extent cx="5334000" cy="1245053"/>
             <wp:effectExtent b="0" l="0" r="0" t="0"/>
-            <wp:docPr descr="Droits de connexion distante sur PC01 et PC02" title="" id="92" name="Picture"/>
+            <wp:docPr descr="Droits de connexion distante sur PC01 et PC02" title="" id="95" name="Picture"/>
             <a:graphic>
               <a:graphicData uri="http://schemas.openxmlformats.org/drawingml/2006/picture">
                 <pic:pic>
                   <pic:nvPicPr>
-                    <pic:cNvPr descr="../screenshots/P7-2_qui-peut-se-connecter.jpg" id="93" name="Picture"/>
+                    <pic:cNvPr descr="../screenshots/P7-2_qui-peut-se-connecter.jpg" id="96" name="Picture"/>
                     <pic:cNvPicPr>
                       <a:picLocks noChangeArrowheads="1" noChangeAspect="1"/>
                     </pic:cNvPicPr>
                   </pic:nvPicPr>
                   <pic:blipFill>
-                    <a:blip r:embed="rId91"/>
+                    <a:blip r:embed="rId94"/>
                     <a:stretch>
                       <a:fillRect/>
                     </a:stretch>
@@ -5481,8 +5559,8 @@
         <w:t xml:space="preserve">Droits de connexion distante sur PC01 et PC02</w:t>
       </w:r>
     </w:p>
-    <w:bookmarkEnd w:id="94"/>
-    <w:bookmarkStart w:id="104" w:name="Xd7b24236bc058e1016d9d68d318b5ee363c81be"/>
+    <w:bookmarkEnd w:id="97"/>
+    <w:bookmarkStart w:id="107" w:name="Xd7b24236bc058e1016d9d68d318b5ee363c81be"/>
     <w:p>
       <w:pPr>
         <w:pStyle w:val="Heading2"/>
@@ -5669,18 +5747,18 @@
           <wp:inline>
             <wp:extent cx="5334000" cy="1551214"/>
             <wp:effectExtent b="0" l="0" r="0" t="0"/>
-            <wp:docPr descr="Compte svc-patch non administrateur" title="" id="96" name="Picture"/>
+            <wp:docPr descr="Compte svc-patch non administrateur" title="" id="99" name="Picture"/>
             <a:graphic>
               <a:graphicData uri="http://schemas.openxmlformats.org/drawingml/2006/picture">
                 <pic:pic>
                   <pic:nvPicPr>
-                    <pic:cNvPr descr="../screenshots/P7-3_compte-svc-patch-moindre-privilege.jpg" id="97" name="Picture"/>
+                    <pic:cNvPr descr="../screenshots/P7-3_compte-svc-patch-moindre-privilege.jpg" id="100" name="Picture"/>
                     <pic:cNvPicPr>
                       <a:picLocks noChangeArrowheads="1" noChangeAspect="1"/>
                     </pic:cNvPicPr>
                   </pic:nvPicPr>
                   <pic:blipFill>
-                    <a:blip r:embed="rId95"/>
+                    <a:blip r:embed="rId98"/>
                     <a:stretch>
                       <a:fillRect/>
                     </a:stretch>
@@ -5741,18 +5819,18 @@
           <wp:inline>
             <wp:extent cx="5334000" cy="2520723"/>
             <wp:effectExtent b="0" l="0" r="0" t="0"/>
-            <wp:docPr descr="Audit complet avec svc-patch via JEA" title="" id="99" name="Picture"/>
+            <wp:docPr descr="Audit complet avec svc-patch via JEA" title="" id="102" name="Picture"/>
             <a:graphic>
               <a:graphicData uri="http://schemas.openxmlformats.org/drawingml/2006/picture">
                 <pic:pic>
                   <pic:nvPicPr>
-                    <pic:cNvPr descr="../screenshots/P7-3b_audit-complet-svc-patch-JEA.jpg" id="100" name="Picture"/>
+                    <pic:cNvPr descr="../screenshots/P7-3b_audit-complet-svc-patch-JEA.jpg" id="103" name="Picture"/>
                     <pic:cNvPicPr>
                       <a:picLocks noChangeArrowheads="1" noChangeAspect="1"/>
                     </pic:cNvPicPr>
                   </pic:nvPicPr>
                   <pic:blipFill>
-                    <a:blip r:embed="rId98"/>
+                    <a:blip r:embed="rId101"/>
                     <a:stretch>
                       <a:fillRect/>
                     </a:stretch>
@@ -5804,18 +5882,18 @@
           <wp:inline>
             <wp:extent cx="5334000" cy="544362"/>
             <wp:effectExtent b="0" l="0" r="0" t="0"/>
-            <wp:docPr descr="Credential chiffré DPAPI" title="" id="102" name="Picture"/>
+            <wp:docPr descr="Credential chiffré DPAPI" title="" id="105" name="Picture"/>
             <a:graphic>
               <a:graphicData uri="http://schemas.openxmlformats.org/drawingml/2006/picture">
                 <pic:pic>
                   <pic:nvPicPr>
-                    <pic:cNvPr descr="../screenshots/P7_credential-chiffre-DPAPI.jpg" id="103" name="Picture"/>
+                    <pic:cNvPr descr="../screenshots/P7_credential-chiffre-DPAPI.jpg" id="106" name="Picture"/>
                     <pic:cNvPicPr>
                       <a:picLocks noChangeArrowheads="1" noChangeAspect="1"/>
                     </pic:cNvPicPr>
                   </pic:nvPicPr>
                   <pic:blipFill>
-                    <a:blip r:embed="rId101"/>
+                    <a:blip r:embed="rId104"/>
                     <a:stretch>
                       <a:fillRect/>
                     </a:stretch>
@@ -5850,8 +5928,8 @@
         <w:t xml:space="preserve">Credential chiffré DPAPI</w:t>
       </w:r>
     </w:p>
-    <w:bookmarkEnd w:id="104"/>
-    <w:bookmarkStart w:id="108" w:name="protection-des-fichiers-produits-q4"/>
+    <w:bookmarkEnd w:id="107"/>
+    <w:bookmarkStart w:id="111" w:name="protection-des-fichiers-produits-q4"/>
     <w:p>
       <w:pPr>
         <w:pStyle w:val="Heading2"/>
@@ -5997,18 +6075,18 @@
           <wp:inline>
             <wp:extent cx="5334000" cy="2520723"/>
             <wp:effectExtent b="0" l="0" r="0" t="0"/>
-            <wp:docPr descr="ACL avant / après" title="" id="106" name="Picture"/>
+            <wp:docPr descr="ACL avant / après" title="" id="109" name="Picture"/>
             <a:graphic>
               <a:graphicData uri="http://schemas.openxmlformats.org/drawingml/2006/picture">
                 <pic:pic>
                   <pic:nvPicPr>
-                    <pic:cNvPr descr="../screenshots/P7-4_ACL-fichiers.jpg" id="107" name="Picture"/>
+                    <pic:cNvPr descr="../screenshots/P7-4_ACL-fichiers.jpg" id="110" name="Picture"/>
                     <pic:cNvPicPr>
                       <a:picLocks noChangeArrowheads="1" noChangeAspect="1"/>
                     </pic:cNvPicPr>
                   </pic:nvPicPr>
                   <pic:blipFill>
-                    <a:blip r:embed="rId105"/>
+                    <a:blip r:embed="rId108"/>
                     <a:stretch>
                       <a:fillRect/>
                     </a:stretch>
@@ -6093,8 +6171,8 @@
         <w:t xml:space="preserve">).</w:t>
       </w:r>
     </w:p>
-    <w:bookmarkEnd w:id="108"/>
-    <w:bookmarkStart w:id="112" w:name="pare-feu-winrm-q5"/>
+    <w:bookmarkEnd w:id="111"/>
+    <w:bookmarkStart w:id="115" w:name="pare-feu-winrm-q5"/>
     <w:p>
       <w:pPr>
         <w:pStyle w:val="Heading2"/>
@@ -6202,18 +6280,18 @@
           <wp:inline>
             <wp:extent cx="5334000" cy="2520723"/>
             <wp:effectExtent b="0" l="0" r="0" t="0"/>
-            <wp:docPr descr="Règles de pare-feu WinRM avant / après et vérification" title="" id="110" name="Picture"/>
+            <wp:docPr descr="Règles de pare-feu WinRM avant / après et vérification" title="" id="113" name="Picture"/>
             <a:graphic>
               <a:graphicData uri="http://schemas.openxmlformats.org/drawingml/2006/picture">
                 <pic:pic>
                   <pic:nvPicPr>
-                    <pic:cNvPr descr="../screenshots/P7-5_pare-feu-WinRM.jpg" id="111" name="Picture"/>
+                    <pic:cNvPr descr="../screenshots/P7-5_pare-feu-WinRM.jpg" id="114" name="Picture"/>
                     <pic:cNvPicPr>
                       <a:picLocks noChangeArrowheads="1" noChangeAspect="1"/>
                     </pic:cNvPicPr>
                   </pic:nvPicPr>
                   <pic:blipFill>
-                    <a:blip r:embed="rId109"/>
+                    <a:blip r:embed="rId112"/>
                     <a:stretch>
                       <a:fillRect/>
                     </a:stretch>
@@ -6297,8 +6375,8 @@
         <w:t xml:space="preserve">d’une mesure de sécurité, pas seulement l’appliquer.</w:t>
       </w:r>
     </w:p>
-    <w:bookmarkEnd w:id="112"/>
-    <w:bookmarkStart w:id="119" w:name="X326bd7ac1eb7066dfde915091867af039064a1e"/>
+    <w:bookmarkEnd w:id="115"/>
+    <w:bookmarkStart w:id="122" w:name="X326bd7ac1eb7066dfde915091867af039064a1e"/>
     <w:p>
       <w:pPr>
         <w:pStyle w:val="Heading2"/>
@@ -6417,18 +6495,18 @@
           <wp:inline>
             <wp:extent cx="5334000" cy="3007701"/>
             <wp:effectExtent b="0" l="0" r="0" t="0"/>
-            <wp:docPr descr="Méthodes d’authentification et protocole réellement utilisé" title="" id="114" name="Picture"/>
+            <wp:docPr descr="Méthodes d’authentification et protocole réellement utilisé" title="" id="117" name="Picture"/>
             <a:graphic>
               <a:graphicData uri="http://schemas.openxmlformats.org/drawingml/2006/picture">
                 <pic:pic>
                   <pic:nvPicPr>
-                    <pic:cNvPr descr="../screenshots/P7-6_authentification-NTLM.jpg" id="115" name="Picture"/>
+                    <pic:cNvPr descr="../screenshots/P7-6_authentification-NTLM.jpg" id="118" name="Picture"/>
                     <pic:cNvPicPr>
                       <a:picLocks noChangeArrowheads="1" noChangeAspect="1"/>
                     </pic:cNvPicPr>
                   </pic:nvPicPr>
                   <pic:blipFill>
-                    <a:blip r:embed="rId113"/>
+                    <a:blip r:embed="rId116"/>
                     <a:stretch>
                       <a:fillRect/>
                     </a:stretch>
@@ -6512,18 +6590,18 @@
           <wp:inline>
             <wp:extent cx="5334000" cy="2037669"/>
             <wp:effectExtent b="0" l="0" r="0" t="0"/>
-            <wp:docPr descr="Durcissement du client WinRM" title="" id="117" name="Picture"/>
+            <wp:docPr descr="Durcissement du client WinRM" title="" id="120" name="Picture"/>
             <a:graphic>
               <a:graphicData uri="http://schemas.openxmlformats.org/drawingml/2006/picture">
                 <pic:pic>
                   <pic:nvPicPr>
-                    <pic:cNvPr descr="../screenshots/P7-6b_durcissement-client-WinRM.jpg" id="118" name="Picture"/>
+                    <pic:cNvPr descr="../screenshots/P7-6b_durcissement-client-WinRM.jpg" id="121" name="Picture"/>
                     <pic:cNvPicPr>
                       <a:picLocks noChangeArrowheads="1" noChangeAspect="1"/>
                     </pic:cNvPicPr>
                   </pic:nvPicPr>
                   <pic:blipFill>
-                    <a:blip r:embed="rId116"/>
+                    <a:blip r:embed="rId119"/>
                     <a:stretch>
                       <a:fillRect/>
                     </a:stretch>
@@ -6664,8 +6742,8 @@
         <w:t xml:space="preserve">explicite et des mots de passe locaux uniques (LAPS).</w:t>
       </w:r>
     </w:p>
-    <w:bookmarkEnd w:id="119"/>
-    <w:bookmarkStart w:id="123" w:name="just-enough-administration-q7"/>
+    <w:bookmarkEnd w:id="122"/>
+    <w:bookmarkStart w:id="126" w:name="just-enough-administration-q7"/>
     <w:p>
       <w:pPr>
         <w:pStyle w:val="Heading2"/>
@@ -6997,18 +7075,18 @@
           <wp:inline>
             <wp:extent cx="5334000" cy="3007701"/>
             <wp:effectExtent b="0" l="0" r="0" t="0"/>
-            <wp:docPr descr="Point de terminaison JEA PatchAudit" title="" id="121" name="Picture"/>
+            <wp:docPr descr="Point de terminaison JEA PatchAudit" title="" id="124" name="Picture"/>
             <a:graphic>
               <a:graphicData uri="http://schemas.openxmlformats.org/drawingml/2006/picture">
                 <pic:pic>
                   <pic:nvPicPr>
-                    <pic:cNvPr descr="../screenshots/P7-7_JEA-PatchAudit.jpg" id="122" name="Picture"/>
+                    <pic:cNvPr descr="../screenshots/P7-7_JEA-PatchAudit.jpg" id="125" name="Picture"/>
                     <pic:cNvPicPr>
                       <a:picLocks noChangeArrowheads="1" noChangeAspect="1"/>
                     </pic:cNvPicPr>
                   </pic:nvPicPr>
                   <pic:blipFill>
-                    <a:blip r:embed="rId120"/>
+                    <a:blip r:embed="rId123"/>
                     <a:stretch>
                       <a:fillRect/>
                     </a:stretch>
@@ -7043,8 +7121,8 @@
         <w:t xml:space="preserve">Point de terminaison JEA PatchAudit</w:t>
       </w:r>
     </w:p>
-    <w:bookmarkEnd w:id="123"/>
-    <w:bookmarkStart w:id="124" w:name="Xa5007d34547534aeb13eaa27ecf966de56fe557"/>
+    <w:bookmarkEnd w:id="126"/>
+    <w:bookmarkStart w:id="127" w:name="Xa5007d34547534aeb13eaa27ecf966de56fe557"/>
     <w:p>
       <w:pPr>
         <w:pStyle w:val="Heading2"/>
@@ -7314,9 +7392,9 @@
         <w:t xml:space="preserve">par stratégie de groupe) garde une trace de toutes les commandes exécutées sur les postes.</w:t>
       </w:r>
     </w:p>
-    <w:bookmarkEnd w:id="124"/>
-    <w:bookmarkEnd w:id="125"/>
-    <w:bookmarkStart w:id="126" w:name="tests-réalisés-et-résultats"/>
+    <w:bookmarkEnd w:id="127"/>
+    <w:bookmarkEnd w:id="128"/>
+    <w:bookmarkStart w:id="129" w:name="tests-réalisés-et-résultats"/>
     <w:p>
       <w:pPr>
         <w:pStyle w:val="Heading1"/>
@@ -7822,8 +7900,8 @@
         <w:t xml:space="preserve">. Action à mener : terminer l’installation de KB5128942 sur PC01 (puis redémarrer) et vérifier PC03.</w:t>
       </w:r>
     </w:p>
-    <w:bookmarkEnd w:id="126"/>
-    <w:bookmarkStart w:id="127" w:name="limites-et-améliorations-possibles"/>
+    <w:bookmarkEnd w:id="129"/>
+    <w:bookmarkStart w:id="130" w:name="limites-et-améliorations-possibles"/>
     <w:p>
       <w:pPr>
         <w:pStyle w:val="Heading1"/>
@@ -8043,8 +8121,8 @@
         <w:t xml:space="preserve">WinRM en HTTPS avec certificats et planification de l’audit (tâche planifiée sous le compte de service) seraient les prochaines étapes vers une utilisation en production.</w:t>
       </w:r>
     </w:p>
-    <w:bookmarkEnd w:id="127"/>
-    <w:bookmarkStart w:id="128" w:name="conclusion"/>
+    <w:bookmarkEnd w:id="130"/>
+    <w:bookmarkStart w:id="131" w:name="conclusion"/>
     <w:p>
       <w:pPr>
         <w:pStyle w:val="Heading1"/>
@@ -8085,8 +8163,8 @@
         <w:t xml:space="preserve">après application.</w:t>
       </w:r>
     </w:p>
-    <w:bookmarkEnd w:id="128"/>
-    <w:bookmarkStart w:id="129" w:name="annexe-utilisation"/>
+    <w:bookmarkEnd w:id="131"/>
+    <w:bookmarkStart w:id="132" w:name="annexe-utilisation"/>
     <w:p>
       <w:pPr>
         <w:pStyle w:val="Heading1"/>
@@ -8187,8 +8265,10 @@
         <w:t xml:space="preserve">.\PatchManager.ps1</w:t>
       </w:r>
     </w:p>
-    <w:bookmarkEnd w:id="129"/>
+    <w:bookmarkEnd w:id="132"/>
     <w:sectPr>
+      <w:footerReference xmlns:r="http://schemas.openxmlformats.org/officeDocument/2006/relationships" r:id="rIdFooterPM" w:type="default"/>
+      <w:titlePg/>
       <w:footnotePr>
         <w:numRestart w:val="eachSect"/>
       </w:footnotePr>
@@ -8199,6 +8279,52 @@
 
 <file path=word/comments.xml><?xml version="1.0" encoding="utf-8"?>
 <w:comments xmlns:w="http://schemas.openxmlformats.org/wordprocessingml/2006/main" xmlns:m="http://schemas.openxmlformats.org/officeDocument/2006/math" xmlns:r="http://schemas.openxmlformats.org/officeDocument/2006/relationships" xmlns:o="urn:schemas-microsoft-com:office:office" xmlns:v="urn:schemas-microsoft-com:vml" xmlns:w10="urn:schemas-microsoft-com:office:word" xmlns:a="http://schemas.openxmlformats.org/drawingml/2006/main" xmlns:pic="http://schemas.openxmlformats.org/drawingml/2006/picture" xmlns:wp="http://schemas.openxmlformats.org/drawingml/2006/wordprocessingDrawing"/>
+</file>
+
+<file path=word/footer1.xml><?xml version="1.0" encoding="utf-8"?>
+<w:ftr xmlns:w="http://schemas.openxmlformats.org/wordprocessingml/2006/main">
+  <w:p>
+    <w:pPr>
+      <w:jc w:val="center"/>
+    </w:pPr>
+    <w:r>
+      <w:rPr>
+        <w:sz w:val="18"/>
+      </w:rPr>
+      <w:t xml:space="preserve">Patch Management PowerShell — FEGHOUL / GABOUTY — page </w:t>
+    </w:r>
+    <w:r>
+      <w:rPr>
+        <w:sz w:val="18"/>
+      </w:rPr>
+      <w:fldChar w:fldCharType="begin"/>
+    </w:r>
+    <w:r>
+      <w:rPr>
+        <w:sz w:val="18"/>
+      </w:rPr>
+      <w:instrText xml:space="preserve"> PAGE </w:instrText>
+    </w:r>
+    <w:r>
+      <w:rPr>
+        <w:sz w:val="18"/>
+      </w:rPr>
+      <w:fldChar w:fldCharType="separate"/>
+    </w:r>
+    <w:r>
+      <w:rPr>
+        <w:sz w:val="18"/>
+      </w:rPr>
+      <w:t>1</w:t>
+    </w:r>
+    <w:r>
+      <w:rPr>
+        <w:sz w:val="18"/>
+      </w:rPr>
+      <w:fldChar w:fldCharType="end"/>
+    </w:r>
+  </w:p>
+</w:ftr>
 </file>
 
 <file path=word/footnotes.xml><?xml version="1.0" encoding="utf-8"?>

</xml_diff>

<commit_message>
Rapport : lien du depot GitHub
Co-Authored-By: Claude Opus 5.5 <noreply@anthropic.com>
</commit_message>
<xml_diff>
--- a/rapport/Rapport_PatchManagement.docx
+++ b/rapport/Rapport_PatchManagement.docx
@@ -39,7 +39,7 @@
         <w:pStyle w:val="Date"/>
       </w:pPr>
       <w:r>
-        <w:t xml:space="preserve">Enseignant : Salim Benayoune — 31 octobre 2026</w:t>
+        <w:t xml:space="preserve">Enseignant : Salim Benayoune — 31 octobre 2026 — Dépôt GitHub : https://github.com/LorisFGL/PatchManager</w:t>
       </w:r>
     </w:p>
     <w:p>
@@ -278,7 +278,7 @@
       </w:r>
     </w:p>
     <w:bookmarkEnd w:id="9"/>
-    <w:bookmarkStart w:id="16" w:name="environnement-de-test"/>
+    <w:bookmarkStart w:id="17" w:name="environnement-de-test"/>
     <w:p>
       <w:pPr>
         <w:pStyle w:val="Heading1"/>
@@ -680,13 +680,37 @@
       </w:r>
     </w:p>
     <w:bookmarkEnd w:id="13"/>
-    <w:bookmarkStart w:id="14" w:name="organisation-du-code"/>
+    <w:bookmarkStart w:id="15" w:name="organisation-du-code"/>
     <w:p>
       <w:pPr>
         <w:pStyle w:val="Heading2"/>
       </w:pPr>
       <w:r>
         <w:t xml:space="preserve">2.2 Organisation du code</w:t>
+      </w:r>
+    </w:p>
+    <w:p>
+      <w:pPr>
+        <w:pStyle w:val="FirstParagraph"/>
+      </w:pPr>
+      <w:r>
+        <w:t xml:space="preserve">Le code source complet, les fichiers de configuration, les captures et l’historique du projet sont disponibles sur le dépôt GitHub :</w:t>
+      </w:r>
+      <w:r>
+        <w:t xml:space="preserve"> </w:t>
+      </w:r>
+      <w:hyperlink r:id="rId14">
+        <w:r>
+          <w:rPr>
+            <w:rStyle w:val="Hyperlink"/>
+            <w:b/>
+            <w:bCs/>
+          </w:rPr>
+          <w:t xml:space="preserve">https://github.com/LorisFGL/PatchManager</w:t>
+        </w:r>
+      </w:hyperlink>
+      <w:r>
+        <w:t xml:space="preserve">.</w:t>
       </w:r>
     </w:p>
     <w:tbl>
@@ -1449,8 +1473,8 @@
         <w:t xml:space="preserve">.</w:t>
       </w:r>
     </w:p>
-    <w:bookmarkEnd w:id="14"/>
-    <w:bookmarkStart w:id="15" w:name="choix-techniques"/>
+    <w:bookmarkEnd w:id="15"/>
+    <w:bookmarkStart w:id="16" w:name="choix-techniques"/>
     <w:p>
       <w:pPr>
         <w:pStyle w:val="Heading2"/>
@@ -1761,9 +1785,9 @@
         <w:t xml:space="preserve">: scripts enregistrés en UTF-8 avec BOM pour que Windows PowerShell 5.1 affiche correctement les accents.</w:t>
       </w:r>
     </w:p>
-    <w:bookmarkEnd w:id="15"/>
     <w:bookmarkEnd w:id="16"/>
-    <w:bookmarkStart w:id="54" w:name="partie-1-préparation-de-lenvironnement"/>
+    <w:bookmarkEnd w:id="17"/>
+    <w:bookmarkStart w:id="55" w:name="partie-1-préparation-de-lenvironnement"/>
     <w:p>
       <w:pPr>
         <w:pStyle w:val="Heading1"/>
@@ -1772,7 +1796,7 @@
         <w:t xml:space="preserve">3. Partie 1 — Préparation de l’environnement</w:t>
       </w:r>
     </w:p>
-    <w:bookmarkStart w:id="20" w:name="connectivité-entre-les-postes-q1"/>
+    <w:bookmarkStart w:id="21" w:name="connectivité-entre-les-postes-q1"/>
     <w:p>
       <w:pPr>
         <w:pStyle w:val="Heading2"/>
@@ -1823,18 +1847,18 @@
           <wp:inline>
             <wp:extent cx="5334000" cy="1979717"/>
             <wp:effectExtent b="0" l="0" r="0" t="0"/>
-            <wp:docPr descr="Connectivité entre PC01 et PC02 (Test-Connection)" title="" id="18" name="Picture"/>
+            <wp:docPr descr="Connectivité entre PC01 et PC02 (Test-Connection)" title="" id="19" name="Picture"/>
             <a:graphic>
               <a:graphicData uri="http://schemas.openxmlformats.org/drawingml/2006/picture">
                 <pic:pic>
                   <pic:nvPicPr>
-                    <pic:cNvPr descr="../screenshots/P1-1_connectivite.jpg" id="19" name="Picture"/>
+                    <pic:cNvPr descr="../screenshots/P1-1_connectivite.jpg" id="20" name="Picture"/>
                     <pic:cNvPicPr>
                       <a:picLocks noChangeArrowheads="1" noChangeAspect="1"/>
                     </pic:cNvPicPr>
                   </pic:nvPicPr>
                   <pic:blipFill>
-                    <a:blip r:embed="rId17"/>
+                    <a:blip r:embed="rId18"/>
                     <a:stretch>
                       <a:fillRect/>
                     </a:stretch>
@@ -1869,8 +1893,8 @@
         <w:t xml:space="preserve">Connectivité entre PC01 et PC02 (Test-Connection)</w:t>
       </w:r>
     </w:p>
-    <w:bookmarkEnd w:id="20"/>
-    <w:bookmarkStart w:id="24" w:name="Xe84f2ac2f0c804abd880fb184b8818a27e99ac2"/>
+    <w:bookmarkEnd w:id="21"/>
+    <w:bookmarkStart w:id="25" w:name="Xe84f2ac2f0c804abd880fb184b8818a27e99ac2"/>
     <w:p>
       <w:pPr>
         <w:pStyle w:val="Heading2"/>
@@ -1963,18 +1987,18 @@
           <wp:inline>
             <wp:extent cx="5334000" cy="1906235"/>
             <wp:effectExtent b="0" l="0" r="0" t="0"/>
-            <wp:docPr descr="computers.txt et résultat de 01-Test-Environment.ps1" title="" id="22" name="Picture"/>
+            <wp:docPr descr="computers.txt et résultat de 01-Test-Environment.ps1" title="" id="23" name="Picture"/>
             <a:graphic>
               <a:graphicData uri="http://schemas.openxmlformats.org/drawingml/2006/picture">
                 <pic:pic>
                   <pic:nvPicPr>
-                    <pic:cNvPr descr="../screenshots/P1-2-3_computers-txt_disponibilite.jpg" id="23" name="Picture"/>
+                    <pic:cNvPr descr="../screenshots/P1-2-3_computers-txt_disponibilite.jpg" id="24" name="Picture"/>
                     <pic:cNvPicPr>
                       <a:picLocks noChangeArrowheads="1" noChangeAspect="1"/>
                     </pic:cNvPicPr>
                   </pic:nvPicPr>
                   <pic:blipFill>
-                    <a:blip r:embed="rId21"/>
+                    <a:blip r:embed="rId22"/>
                     <a:stretch>
                       <a:fillRect/>
                     </a:stretch>
@@ -2009,8 +2033,8 @@
         <w:t xml:space="preserve">computers.txt et résultat de 01-Test-Environment.ps1</w:t>
       </w:r>
     </w:p>
-    <w:bookmarkEnd w:id="24"/>
-    <w:bookmarkStart w:id="28" w:name="Xdaceeeda3c0f7433809a1cb741dc8e3d0f6a715"/>
+    <w:bookmarkEnd w:id="25"/>
+    <w:bookmarkStart w:id="29" w:name="Xdaceeeda3c0f7433809a1cb741dc8e3d0f6a715"/>
     <w:p>
       <w:pPr>
         <w:pStyle w:val="Heading2"/>
@@ -2094,18 +2118,18 @@
           <wp:inline>
             <wp:extent cx="5334000" cy="1667111"/>
             <wp:effectExtent b="0" l="0" r="0" t="0"/>
-            <wp:docPr descr="Service WinRM, écouteur et Test-WSMan" title="" id="26" name="Picture"/>
+            <wp:docPr descr="Service WinRM, écouteur et Test-WSMan" title="" id="27" name="Picture"/>
             <a:graphic>
               <a:graphicData uri="http://schemas.openxmlformats.org/drawingml/2006/picture">
                 <pic:pic>
                   <pic:nvPicPr>
-                    <pic:cNvPr descr="../screenshots/P1-4_WinRM-Test-WSMan.jpg" id="27" name="Picture"/>
+                    <pic:cNvPr descr="../screenshots/P1-4_WinRM-Test-WSMan.jpg" id="28" name="Picture"/>
                     <pic:cNvPicPr>
                       <a:picLocks noChangeArrowheads="1" noChangeAspect="1"/>
                     </pic:cNvPicPr>
                   </pic:nvPicPr>
                   <pic:blipFill>
-                    <a:blip r:embed="rId25"/>
+                    <a:blip r:embed="rId26"/>
                     <a:stretch>
                       <a:fillRect/>
                     </a:stretch>
@@ -2140,8 +2164,8 @@
         <w:t xml:space="preserve">Service WinRM, écouteur et Test-WSMan</w:t>
       </w:r>
     </w:p>
-    <w:bookmarkEnd w:id="28"/>
-    <w:bookmarkStart w:id="32" w:name="session-interactive-enter-pssession-q5"/>
+    <w:bookmarkEnd w:id="29"/>
+    <w:bookmarkStart w:id="33" w:name="session-interactive-enter-pssession-q5"/>
     <w:p>
       <w:pPr>
         <w:pStyle w:val="Heading2"/>
@@ -2231,18 +2255,18 @@
           <wp:inline>
             <wp:extent cx="5334000" cy="2471334"/>
             <wp:effectExtent b="0" l="0" r="0" t="0"/>
-            <wp:docPr descr="Commandes exécutées dans une session Enter-PSSession sur PC02" title="" id="30" name="Picture"/>
+            <wp:docPr descr="Commandes exécutées dans une session Enter-PSSession sur PC02" title="" id="31" name="Picture"/>
             <a:graphic>
               <a:graphicData uri="http://schemas.openxmlformats.org/drawingml/2006/picture">
                 <pic:pic>
                   <pic:nvPicPr>
-                    <pic:cNvPr descr="../screenshots/P1-5_Enter-PSSession.jpg" id="31" name="Picture"/>
+                    <pic:cNvPr descr="../screenshots/P1-5_Enter-PSSession.jpg" id="32" name="Picture"/>
                     <pic:cNvPicPr>
                       <a:picLocks noChangeArrowheads="1" noChangeAspect="1"/>
                     </pic:cNvPicPr>
                   </pic:nvPicPr>
                   <pic:blipFill>
-                    <a:blip r:embed="rId29"/>
+                    <a:blip r:embed="rId30"/>
                     <a:stretch>
                       <a:fillRect/>
                     </a:stretch>
@@ -2277,8 +2301,8 @@
         <w:t xml:space="preserve">Commandes exécutées dans une session Enter-PSSession sur PC02</w:t>
       </w:r>
     </w:p>
-    <w:bookmarkEnd w:id="32"/>
-    <w:bookmarkStart w:id="36" w:name="X56d4623f3e1e1389cf82821dd20af7a6b49b111"/>
+    <w:bookmarkEnd w:id="33"/>
+    <w:bookmarkStart w:id="37" w:name="X56d4623f3e1e1389cf82821dd20af7a6b49b111"/>
     <w:p>
       <w:pPr>
         <w:pStyle w:val="Heading2"/>
@@ -2341,18 +2365,18 @@
           <wp:inline>
             <wp:extent cx="5334000" cy="873248"/>
             <wp:effectExtent b="0" l="0" r="0" t="0"/>
-            <wp:docPr descr="Invoke-Command sur les deux postes en une commande" title="" id="34" name="Picture"/>
+            <wp:docPr descr="Invoke-Command sur les deux postes en une commande" title="" id="35" name="Picture"/>
             <a:graphic>
               <a:graphicData uri="http://schemas.openxmlformats.org/drawingml/2006/picture">
                 <pic:pic>
                   <pic:nvPicPr>
-                    <pic:cNvPr descr="../screenshots/P1-6_Invoke-Command.jpg" id="35" name="Picture"/>
+                    <pic:cNvPr descr="../screenshots/P1-6_Invoke-Command.jpg" id="36" name="Picture"/>
                     <pic:cNvPicPr>
                       <a:picLocks noChangeArrowheads="1" noChangeAspect="1"/>
                     </pic:cNvPicPr>
                   </pic:nvPicPr>
                   <pic:blipFill>
-                    <a:blip r:embed="rId33"/>
+                    <a:blip r:embed="rId34"/>
                     <a:stretch>
                       <a:fillRect/>
                     </a:stretch>
@@ -2387,8 +2411,8 @@
         <w:t xml:space="preserve">Invoke-Command sur les deux postes en une commande</w:t>
       </w:r>
     </w:p>
-    <w:bookmarkEnd w:id="36"/>
-    <w:bookmarkStart w:id="52" w:name="X04d1c6b906a5cb21d5fa1b89e4c71aab570b8eb"/>
+    <w:bookmarkEnd w:id="37"/>
+    <w:bookmarkStart w:id="53" w:name="X04d1c6b906a5cb21d5fa1b89e4c71aab570b8eb"/>
     <w:p>
       <w:pPr>
         <w:pStyle w:val="Heading2"/>
@@ -2430,18 +2454,18 @@
           <wp:inline>
             <wp:extent cx="5334000" cy="699355"/>
             <wp:effectExtent b="0" l="0" r="0" t="0"/>
-            <wp:docPr descr="Accès refusé vers PC02, OK vers PC01" title="" id="38" name="Picture"/>
+            <wp:docPr descr="Accès refusé vers PC02, OK vers PC01" title="" id="39" name="Picture"/>
             <a:graphic>
               <a:graphicData uri="http://schemas.openxmlformats.org/drawingml/2006/picture">
                 <pic:pic>
                   <pic:nvPicPr>
-                    <pic:cNvPr descr="../screenshots/DEPANNAGE-00_acces-refuse-PC02.jpg" id="39" name="Picture"/>
+                    <pic:cNvPr descr="../screenshots/DEPANNAGE-00_acces-refuse-PC02.jpg" id="40" name="Picture"/>
                     <pic:cNvPicPr>
                       <a:picLocks noChangeArrowheads="1" noChangeAspect="1"/>
                     </pic:cNvPicPr>
                   </pic:nvPicPr>
                   <pic:blipFill>
-                    <a:blip r:embed="rId37"/>
+                    <a:blip r:embed="rId38"/>
                     <a:stretch>
                       <a:fillRect/>
                     </a:stretch>
@@ -2541,18 +2565,18 @@
           <wp:inline>
             <wp:extent cx="5334000" cy="1994933"/>
             <wp:effectExtent b="0" l="0" r="0" t="0"/>
-            <wp:docPr descr="Événements 4625 sur PC02" title="" id="41" name="Picture"/>
+            <wp:docPr descr="Événements 4625 sur PC02" title="" id="42" name="Picture"/>
             <a:graphic>
               <a:graphicData uri="http://schemas.openxmlformats.org/drawingml/2006/picture">
                 <pic:pic>
                   <pic:nvPicPr>
-                    <pic:cNvPr descr="../screenshots/DEPANNAGE-0_event4625-0xC000006D.jpg" id="42" name="Picture"/>
+                    <pic:cNvPr descr="../screenshots/DEPANNAGE-0_event4625-0xC000006D.jpg" id="43" name="Picture"/>
                     <pic:cNvPicPr>
                       <a:picLocks noChangeArrowheads="1" noChangeAspect="1"/>
                     </pic:cNvPicPr>
                   </pic:nvPicPr>
                   <pic:blipFill>
-                    <a:blip r:embed="rId40"/>
+                    <a:blip r:embed="rId41"/>
                     <a:stretch>
                       <a:fillRect/>
                     </a:stretch>
@@ -2650,18 +2674,18 @@
           <wp:inline>
             <wp:extent cx="5334000" cy="704398"/>
             <wp:effectExtent b="0" l="0" r="0" t="0"/>
-            <wp:docPr descr="SID identique sur PC02…" title="" id="44" name="Picture"/>
+            <wp:docPr descr="SID identique sur PC02…" title="" id="45" name="Picture"/>
             <a:graphic>
               <a:graphicData uri="http://schemas.openxmlformats.org/drawingml/2006/picture">
                 <pic:pic>
                   <pic:nvPicPr>
-                    <pic:cNvPr descr="../screenshots/DEPANNAGE-1_SID-PC02.jpg" id="45" name="Picture"/>
+                    <pic:cNvPr descr="../screenshots/DEPANNAGE-1_SID-PC02.jpg" id="46" name="Picture"/>
                     <pic:cNvPicPr>
                       <a:picLocks noChangeArrowheads="1" noChangeAspect="1"/>
                     </pic:cNvPicPr>
                   </pic:nvPicPr>
                   <pic:blipFill>
-                    <a:blip r:embed="rId43"/>
+                    <a:blip r:embed="rId44"/>
                     <a:stretch>
                       <a:fillRect/>
                     </a:stretch>
@@ -2705,18 +2729,18 @@
           <wp:inline>
             <wp:extent cx="5334000" cy="427497"/>
             <wp:effectExtent b="0" l="0" r="0" t="0"/>
-            <wp:docPr descr="…et sur PC01" title="" id="47" name="Picture"/>
+            <wp:docPr descr="…et sur PC01" title="" id="48" name="Picture"/>
             <a:graphic>
               <a:graphicData uri="http://schemas.openxmlformats.org/drawingml/2006/picture">
                 <pic:pic>
                   <pic:nvPicPr>
-                    <pic:cNvPr descr="../screenshots/DEPANNAGE-2_SID-PC01.jpg" id="48" name="Picture"/>
+                    <pic:cNvPr descr="../screenshots/DEPANNAGE-2_SID-PC01.jpg" id="49" name="Picture"/>
                     <pic:cNvPicPr>
                       <a:picLocks noChangeArrowheads="1" noChangeAspect="1"/>
                     </pic:cNvPicPr>
                   </pic:nvPicPr>
                   <pic:blipFill>
-                    <a:blip r:embed="rId46"/>
+                    <a:blip r:embed="rId47"/>
                     <a:stretch>
                       <a:fillRect/>
                     </a:stretch>
@@ -2780,18 +2804,18 @@
           <wp:inline>
             <wp:extent cx="5334000" cy="464976"/>
             <wp:effectExtent b="0" l="0" r="0" t="0"/>
-            <wp:docPr descr="Après Sysprep : SID différents, accès OK" title="" id="50" name="Picture"/>
+            <wp:docPr descr="Après Sysprep : SID différents, accès OK" title="" id="51" name="Picture"/>
             <a:graphic>
               <a:graphicData uri="http://schemas.openxmlformats.org/drawingml/2006/picture">
                 <pic:pic>
                   <pic:nvPicPr>
-                    <pic:cNvPr descr="../screenshots/DEPANNAGE-3_resolu-apres-sysprep.jpg" id="51" name="Picture"/>
+                    <pic:cNvPr descr="../screenshots/DEPANNAGE-3_resolu-apres-sysprep.jpg" id="52" name="Picture"/>
                     <pic:cNvPicPr>
                       <a:picLocks noChangeArrowheads="1" noChangeAspect="1"/>
                     </pic:cNvPicPr>
                   </pic:nvPicPr>
                   <pic:blipFill>
-                    <a:blip r:embed="rId49"/>
+                    <a:blip r:embed="rId50"/>
                     <a:stretch>
                       <a:fillRect/>
                     </a:stretch>
@@ -2844,8 +2868,8 @@
         <w:t xml:space="preserve">: on ne déploie jamais un clone Windows sans Sysprep ; c’est la procédure normale de préparation d’une image (master).</w:t>
       </w:r>
     </w:p>
-    <w:bookmarkEnd w:id="52"/>
-    <w:bookmarkStart w:id="53" w:name="réponses-aux-questions-de-la-partie-1"/>
+    <w:bookmarkEnd w:id="53"/>
+    <w:bookmarkStart w:id="54" w:name="réponses-aux-questions-de-la-partie-1"/>
     <w:p>
       <w:pPr>
         <w:pStyle w:val="Heading2"/>
@@ -3205,9 +3229,9 @@
         <w:t xml:space="preserve">désactive la vérification de l’identité des serveurs ; des méthodes faibles (Basic, trafic non chiffré) exposent les mots de passe ; un compte d’administration unique utilisé partout devient une cible de choix ; et sans journalisation, les actions ne sont pas traçables. Ces risques sont traités en partie 7.</w:t>
       </w:r>
     </w:p>
-    <w:bookmarkEnd w:id="53"/>
     <w:bookmarkEnd w:id="54"/>
-    <w:bookmarkStart w:id="61" w:name="partie-2-inventaire-du-parc"/>
+    <w:bookmarkEnd w:id="55"/>
+    <w:bookmarkStart w:id="62" w:name="partie-2-inventaire-du-parc"/>
     <w:p>
       <w:pPr>
         <w:pStyle w:val="Heading1"/>
@@ -3294,18 +3318,18 @@
           <wp:inline>
             <wp:extent cx="5334000" cy="1088725"/>
             <wp:effectExtent b="0" l="0" r="0" t="0"/>
-            <wp:docPr descr="Tableau récapitulatif de l’inventaire" title="" id="56" name="Picture"/>
+            <wp:docPr descr="Tableau récapitulatif de l’inventaire" title="" id="57" name="Picture"/>
             <a:graphic>
               <a:graphicData uri="http://schemas.openxmlformats.org/drawingml/2006/picture">
                 <pic:pic>
                   <pic:nvPicPr>
-                    <pic:cNvPr descr="../screenshots/P2-1_inventaire-tableau.jpg" id="57" name="Picture"/>
+                    <pic:cNvPr descr="../screenshots/P2-1_inventaire-tableau.jpg" id="58" name="Picture"/>
                     <pic:cNvPicPr>
                       <a:picLocks noChangeArrowheads="1" noChangeAspect="1"/>
                     </pic:cNvPicPr>
                   </pic:nvPicPr>
                   <pic:blipFill>
-                    <a:blip r:embed="rId55"/>
+                    <a:blip r:embed="rId56"/>
                     <a:stretch>
                       <a:fillRect/>
                     </a:stretch>
@@ -3388,18 +3412,18 @@
           <wp:inline>
             <wp:extent cx="5334000" cy="4147704"/>
             <wp:effectExtent b="0" l="0" r="0" t="0"/>
-            <wp:docPr descr="Détail de Inventory.csv" title="" id="59" name="Picture"/>
+            <wp:docPr descr="Détail de Inventory.csv" title="" id="60" name="Picture"/>
             <a:graphic>
               <a:graphicData uri="http://schemas.openxmlformats.org/drawingml/2006/picture">
                 <pic:pic>
                   <pic:nvPicPr>
-                    <pic:cNvPr descr="../screenshots/P2-2_inventaire-detail-csv.jpg" id="60" name="Picture"/>
+                    <pic:cNvPr descr="../screenshots/P2-2_inventaire-detail-csv.jpg" id="61" name="Picture"/>
                     <pic:cNvPicPr>
                       <a:picLocks noChangeArrowheads="1" noChangeAspect="1"/>
                     </pic:cNvPicPr>
                   </pic:nvPicPr>
                   <pic:blipFill>
-                    <a:blip r:embed="rId58"/>
+                    <a:blip r:embed="rId59"/>
                     <a:stretch>
                       <a:fillRect/>
                     </a:stretch>
@@ -3442,8 +3466,8 @@
         <w:t xml:space="preserve">Remarque : les VM étant sous VMware sur Apple Silicon, le modèle remonte « VMware20,1 » et l’architecture « Processeur ARM 64 bits ».</w:t>
       </w:r>
     </w:p>
-    <w:bookmarkEnd w:id="61"/>
-    <w:bookmarkStart w:id="68" w:name="partie-3-inventaire-des-correctifs"/>
+    <w:bookmarkEnd w:id="62"/>
+    <w:bookmarkStart w:id="69" w:name="partie-3-inventaire-des-correctifs"/>
     <w:p>
       <w:pPr>
         <w:pStyle w:val="Heading1"/>
@@ -3527,18 +3551,18 @@
           <wp:inline>
             <wp:extent cx="5334000" cy="2561544"/>
             <wp:effectExtent b="0" l="0" r="0" t="0"/>
-            <wp:docPr descr="Correctifs locaux et synthèse par poste" title="" id="63" name="Picture"/>
+            <wp:docPr descr="Correctifs locaux et synthèse par poste" title="" id="64" name="Picture"/>
             <a:graphic>
               <a:graphicData uri="http://schemas.openxmlformats.org/drawingml/2006/picture">
                 <pic:pic>
                   <pic:nvPicPr>
-                    <pic:cNvPr descr="../screenshots/P3-1_correctifs-local-et-synthese.jpg" id="64" name="Picture"/>
+                    <pic:cNvPr descr="../screenshots/P3-1_correctifs-local-et-synthese.jpg" id="65" name="Picture"/>
                     <pic:cNvPicPr>
                       <a:picLocks noChangeArrowheads="1" noChangeAspect="1"/>
                     </pic:cNvPicPr>
                   </pic:nvPicPr>
                   <pic:blipFill>
-                    <a:blip r:embed="rId62"/>
+                    <a:blip r:embed="rId63"/>
                     <a:stretch>
                       <a:fillRect/>
                     </a:stretch>
@@ -3649,18 +3673,18 @@
           <wp:inline>
             <wp:extent cx="5334000" cy="1922008"/>
             <wp:effectExtent b="0" l="0" r="0" t="0"/>
-            <wp:docPr descr="PatchesInventory.csv et PatchSummary.csv" title="" id="66" name="Picture"/>
+            <wp:docPr descr="PatchesInventory.csv et PatchSummary.csv" title="" id="67" name="Picture"/>
             <a:graphic>
               <a:graphicData uri="http://schemas.openxmlformats.org/drawingml/2006/picture">
                 <pic:pic>
                   <pic:nvPicPr>
-                    <pic:cNvPr descr="../screenshots/P3-2_PatchesInventory-csv.jpg" id="67" name="Picture"/>
+                    <pic:cNvPr descr="../screenshots/P3-2_PatchesInventory-csv.jpg" id="68" name="Picture"/>
                     <pic:cNvPicPr>
                       <a:picLocks noChangeArrowheads="1" noChangeAspect="1"/>
                     </pic:cNvPicPr>
                   </pic:nvPicPr>
                   <pic:blipFill>
-                    <a:blip r:embed="rId65"/>
+                    <a:blip r:embed="rId66"/>
                     <a:stretch>
                       <a:fillRect/>
                     </a:stretch>
@@ -3719,8 +3743,8 @@
         <w:t xml:space="preserve">: PC02 l’a reçue lors de sa réinstallation (phase OOBE après Sysprep), tandis que sur PC01 l’installation lancée depuis Windows Update n’était pas encore terminée au moment de l’audit. Ce décalage réel entre deux postes est exactement le type de situation que le Patch Management doit détecter.</w:t>
       </w:r>
     </w:p>
-    <w:bookmarkEnd w:id="68"/>
-    <w:bookmarkStart w:id="72" w:name="partie-4-contrôle-de-conformité"/>
+    <w:bookmarkEnd w:id="69"/>
+    <w:bookmarkStart w:id="73" w:name="partie-4-contrôle-de-conformité"/>
     <w:p>
       <w:pPr>
         <w:pStyle w:val="Heading1"/>
@@ -3918,18 +3942,18 @@
           <wp:inline>
             <wp:extent cx="5334000" cy="1922008"/>
             <wp:effectExtent b="0" l="0" r="0" t="0"/>
-            <wp:docPr descr="required-patches.txt et contrôle de conformité" title="" id="70" name="Picture"/>
+            <wp:docPr descr="required-patches.txt et contrôle de conformité" title="" id="71" name="Picture"/>
             <a:graphic>
               <a:graphicData uri="http://schemas.openxmlformats.org/drawingml/2006/picture">
                 <pic:pic>
                   <pic:nvPicPr>
-                    <pic:cNvPr descr="../screenshots/P4_conformite.jpg" id="71" name="Picture"/>
+                    <pic:cNvPr descr="../screenshots/P4_conformite.jpg" id="72" name="Picture"/>
                     <pic:cNvPicPr>
                       <a:picLocks noChangeArrowheads="1" noChangeAspect="1"/>
                     </pic:cNvPicPr>
                   </pic:nvPicPr>
                   <pic:blipFill>
-                    <a:blip r:embed="rId69"/>
+                    <a:blip r:embed="rId70"/>
                     <a:stretch>
                       <a:fillRect/>
                     </a:stretch>
@@ -4024,8 +4048,8 @@
         <w:t xml:space="preserve">: un poste « conforme » à une liste périmée peut rester vulnérable. Ici, la politique a d’ailleurs été mise à jour le 27/10 pour inclure la cumulative d’octobre, ce qui a rendu PC01 non conforme.</w:t>
       </w:r>
     </w:p>
-    <w:bookmarkEnd w:id="72"/>
-    <w:bookmarkStart w:id="82" w:name="partie-5-rapport-de-sécurité"/>
+    <w:bookmarkEnd w:id="73"/>
+    <w:bookmarkStart w:id="83" w:name="partie-5-rapport-de-sécurité"/>
     <w:p>
       <w:pPr>
         <w:pStyle w:val="Heading1"/>
@@ -4103,18 +4127,18 @@
           <wp:inline>
             <wp:extent cx="5334000" cy="2241776"/>
             <wp:effectExtent b="0" l="0" r="0" t="0"/>
-            <wp:docPr descr="Génération du rapport et journal" title="" id="74" name="Picture"/>
+            <wp:docPr descr="Génération du rapport et journal" title="" id="75" name="Picture"/>
             <a:graphic>
               <a:graphicData uri="http://schemas.openxmlformats.org/drawingml/2006/picture">
                 <pic:pic>
                   <pic:nvPicPr>
-                    <pic:cNvPr descr="../screenshots/P5-1_rapport-et-journal.jpg" id="75" name="Picture"/>
+                    <pic:cNvPr descr="../screenshots/P5-1_rapport-et-journal.jpg" id="76" name="Picture"/>
                     <pic:cNvPicPr>
                       <a:picLocks noChangeArrowheads="1" noChangeAspect="1"/>
                     </pic:cNvPicPr>
                   </pic:nvPicPr>
                   <pic:blipFill>
-                    <a:blip r:embed="rId73"/>
+                    <a:blip r:embed="rId74"/>
                     <a:stretch>
                       <a:fillRect/>
                     </a:stretch>
@@ -4191,18 +4215,18 @@
           <wp:inline>
             <wp:extent cx="5334000" cy="2333625"/>
             <wp:effectExtent b="0" l="0" r="0" t="0"/>
-            <wp:docPr descr="Rapport HTML dans Microsoft Edge" title="" id="77" name="Picture"/>
+            <wp:docPr descr="Rapport HTML dans Microsoft Edge" title="" id="78" name="Picture"/>
             <a:graphic>
               <a:graphicData uri="http://schemas.openxmlformats.org/drawingml/2006/picture">
                 <pic:pic>
                   <pic:nvPicPr>
-                    <pic:cNvPr descr="../screenshots/P5-2_rapport-HTML.jpg" id="78" name="Picture"/>
+                    <pic:cNvPr descr="../screenshots/P5-2_rapport-HTML.jpg" id="79" name="Picture"/>
                     <pic:cNvPicPr>
                       <a:picLocks noChangeArrowheads="1" noChangeAspect="1"/>
                     </pic:cNvPicPr>
                   </pic:nvPicPr>
                   <pic:blipFill>
-                    <a:blip r:embed="rId76"/>
+                    <a:blip r:embed="rId77"/>
                     <a:stretch>
                       <a:fillRect/>
                     </a:stretch>
@@ -4293,18 +4317,18 @@
           <wp:inline>
             <wp:extent cx="5334000" cy="1813151"/>
             <wp:effectExtent b="0" l="0" r="0" t="0"/>
-            <wp:docPr descr="Journal d’un audit complet, du début à la fin" title="" id="80" name="Picture"/>
+            <wp:docPr descr="Journal d’un audit complet, du début à la fin" title="" id="81" name="Picture"/>
             <a:graphic>
               <a:graphicData uri="http://schemas.openxmlformats.org/drawingml/2006/picture">
                 <pic:pic>
                   <pic:nvPicPr>
-                    <pic:cNvPr descr="../screenshots/P5-3_journal-audit-complet.jpg" id="81" name="Picture"/>
+                    <pic:cNvPr descr="../screenshots/P5-3_journal-audit-complet.jpg" id="82" name="Picture"/>
                     <pic:cNvPicPr>
                       <a:picLocks noChangeArrowheads="1" noChangeAspect="1"/>
                     </pic:cNvPicPr>
                   </pic:nvPicPr>
                   <pic:blipFill>
-                    <a:blip r:embed="rId79"/>
+                    <a:blip r:embed="rId80"/>
                     <a:stretch>
                       <a:fillRect/>
                     </a:stretch>
@@ -4401,8 +4425,8 @@
         <w:t xml:space="preserve">était appelé avec une syntaxe invalide pour la somme des KB manquantes.</w:t>
       </w:r>
     </w:p>
-    <w:bookmarkEnd w:id="82"/>
-    <w:bookmarkStart w:id="92" w:name="partie-6-notification"/>
+    <w:bookmarkEnd w:id="83"/>
+    <w:bookmarkStart w:id="93" w:name="partie-6-notification"/>
     <w:p>
       <w:pPr>
         <w:pStyle w:val="Heading1"/>
@@ -4598,18 +4622,18 @@
           <wp:inline>
             <wp:extent cx="5334000" cy="853848"/>
             <wp:effectExtent b="0" l="0" r="0" t="0"/>
-            <wp:docPr descr="Échec d’envoi tracé dans le journal" title="" id="84" name="Picture"/>
+            <wp:docPr descr="Échec d’envoi tracé dans le journal" title="" id="85" name="Picture"/>
             <a:graphic>
               <a:graphicData uri="http://schemas.openxmlformats.org/drawingml/2006/picture">
                 <pic:pic>
                   <pic:nvPicPr>
-                    <pic:cNvPr descr="../screenshots/P6-2_notification-echec-journal.jpg" id="85" name="Picture"/>
+                    <pic:cNvPr descr="../screenshots/P6-2_notification-echec-journal.jpg" id="86" name="Picture"/>
                     <pic:cNvPicPr>
                       <a:picLocks noChangeArrowheads="1" noChangeAspect="1"/>
                     </pic:cNvPicPr>
                   </pic:nvPicPr>
                   <pic:blipFill>
-                    <a:blip r:embed="rId83"/>
+                    <a:blip r:embed="rId84"/>
                     <a:stretch>
                       <a:fillRect/>
                     </a:stretch>
@@ -4686,18 +4710,18 @@
           <wp:inline>
             <wp:extent cx="5334000" cy="604847"/>
             <wp:effectExtent b="0" l="0" r="0" t="0"/>
-            <wp:docPr descr="Message reçu par le serveur SMTP de test" title="" id="87" name="Picture"/>
+            <wp:docPr descr="Message reçu par le serveur SMTP de test" title="" id="88" name="Picture"/>
             <a:graphic>
               <a:graphicData uri="http://schemas.openxmlformats.org/drawingml/2006/picture">
                 <pic:pic>
                   <pic:nvPicPr>
-                    <pic:cNvPr descr="../screenshots/P6-3_serveur-SMTP-test-message-recu.jpg" id="88" name="Picture"/>
+                    <pic:cNvPr descr="../screenshots/P6-3_serveur-SMTP-test-message-recu.jpg" id="89" name="Picture"/>
                     <pic:cNvPicPr>
                       <a:picLocks noChangeArrowheads="1" noChangeAspect="1"/>
                     </pic:cNvPicPr>
                   </pic:nvPicPr>
                   <pic:blipFill>
-                    <a:blip r:embed="rId86"/>
+                    <a:blip r:embed="rId87"/>
                     <a:stretch>
                       <a:fillRect/>
                     </a:stretch>
@@ -4741,18 +4765,18 @@
           <wp:inline>
             <wp:extent cx="5334000" cy="2132919"/>
             <wp:effectExtent b="0" l="0" r="0" t="0"/>
-            <wp:docPr descr="Contenu du message reçu (objet, détail, pièce jointe)" title="" id="90" name="Picture"/>
+            <wp:docPr descr="Contenu du message reçu (objet, détail, pièce jointe)" title="" id="91" name="Picture"/>
             <a:graphic>
               <a:graphicData uri="http://schemas.openxmlformats.org/drawingml/2006/picture">
                 <pic:pic>
                   <pic:nvPicPr>
-                    <pic:cNvPr descr="../screenshots/P6-1_contenu-notification.jpg" id="91" name="Picture"/>
+                    <pic:cNvPr descr="../screenshots/P6-1_contenu-notification.jpg" id="92" name="Picture"/>
                     <pic:cNvPicPr>
                       <a:picLocks noChangeArrowheads="1" noChangeAspect="1"/>
                     </pic:cNvPicPr>
                   </pic:nvPicPr>
                   <pic:blipFill>
-                    <a:blip r:embed="rId89"/>
+                    <a:blip r:embed="rId90"/>
                     <a:stretch>
                       <a:fillRect/>
                     </a:stretch>
@@ -5132,8 +5156,8 @@
         <w:t xml:space="preserve">, Azure Key Vault) plutôt que dans un fichier.</w:t>
       </w:r>
     </w:p>
-    <w:bookmarkEnd w:id="92"/>
-    <w:bookmarkStart w:id="128" w:name="partie-7-sécurisation-de-la-solution"/>
+    <w:bookmarkEnd w:id="93"/>
+    <w:bookmarkStart w:id="129" w:name="partie-7-sécurisation-de-la-solution"/>
     <w:p>
       <w:pPr>
         <w:pStyle w:val="Heading1"/>
@@ -5142,7 +5166,7 @@
         <w:t xml:space="preserve">9. Partie 7 — Sécurisation de la solution</w:t>
       </w:r>
     </w:p>
-    <w:bookmarkStart w:id="93" w:name="X303769c0b63f3283938e5e709992a9f46145e86"/>
+    <w:bookmarkStart w:id="94" w:name="X303769c0b63f3283938e5e709992a9f46145e86"/>
     <w:p>
       <w:pPr>
         <w:pStyle w:val="Heading2"/>
@@ -5385,8 +5409,8 @@
         </w:tc>
       </w:tr>
     </w:tbl>
-    <w:bookmarkEnd w:id="93"/>
-    <w:bookmarkStart w:id="97" w:name="qui-peut-ouvrir-une-session-distante-q2"/>
+    <w:bookmarkEnd w:id="94"/>
+    <w:bookmarkStart w:id="98" w:name="qui-peut-ouvrir-une-session-distante-q2"/>
     <w:p>
       <w:pPr>
         <w:pStyle w:val="Heading2"/>
@@ -5513,18 +5537,18 @@
           <wp:inline>
             <wp:extent cx="5334000" cy="1245053"/>
             <wp:effectExtent b="0" l="0" r="0" t="0"/>
-            <wp:docPr descr="Droits de connexion distante sur PC01 et PC02" title="" id="95" name="Picture"/>
+            <wp:docPr descr="Droits de connexion distante sur PC01 et PC02" title="" id="96" name="Picture"/>
             <a:graphic>
               <a:graphicData uri="http://schemas.openxmlformats.org/drawingml/2006/picture">
                 <pic:pic>
                   <pic:nvPicPr>
-                    <pic:cNvPr descr="../screenshots/P7-2_qui-peut-se-connecter.jpg" id="96" name="Picture"/>
+                    <pic:cNvPr descr="../screenshots/P7-2_qui-peut-se-connecter.jpg" id="97" name="Picture"/>
                     <pic:cNvPicPr>
                       <a:picLocks noChangeArrowheads="1" noChangeAspect="1"/>
                     </pic:cNvPicPr>
                   </pic:nvPicPr>
                   <pic:blipFill>
-                    <a:blip r:embed="rId94"/>
+                    <a:blip r:embed="rId95"/>
                     <a:stretch>
                       <a:fillRect/>
                     </a:stretch>
@@ -5559,8 +5583,8 @@
         <w:t xml:space="preserve">Droits de connexion distante sur PC01 et PC02</w:t>
       </w:r>
     </w:p>
-    <w:bookmarkEnd w:id="97"/>
-    <w:bookmarkStart w:id="107" w:name="Xd7b24236bc058e1016d9d68d318b5ee363c81be"/>
+    <w:bookmarkEnd w:id="98"/>
+    <w:bookmarkStart w:id="108" w:name="Xd7b24236bc058e1016d9d68d318b5ee363c81be"/>
     <w:p>
       <w:pPr>
         <w:pStyle w:val="Heading2"/>
@@ -5747,18 +5771,18 @@
           <wp:inline>
             <wp:extent cx="5334000" cy="1551214"/>
             <wp:effectExtent b="0" l="0" r="0" t="0"/>
-            <wp:docPr descr="Compte svc-patch non administrateur" title="" id="99" name="Picture"/>
+            <wp:docPr descr="Compte svc-patch non administrateur" title="" id="100" name="Picture"/>
             <a:graphic>
               <a:graphicData uri="http://schemas.openxmlformats.org/drawingml/2006/picture">
                 <pic:pic>
                   <pic:nvPicPr>
-                    <pic:cNvPr descr="../screenshots/P7-3_compte-svc-patch-moindre-privilege.jpg" id="100" name="Picture"/>
+                    <pic:cNvPr descr="../screenshots/P7-3_compte-svc-patch-moindre-privilege.jpg" id="101" name="Picture"/>
                     <pic:cNvPicPr>
                       <a:picLocks noChangeArrowheads="1" noChangeAspect="1"/>
                     </pic:cNvPicPr>
                   </pic:nvPicPr>
                   <pic:blipFill>
-                    <a:blip r:embed="rId98"/>
+                    <a:blip r:embed="rId99"/>
                     <a:stretch>
                       <a:fillRect/>
                     </a:stretch>
@@ -5819,18 +5843,18 @@
           <wp:inline>
             <wp:extent cx="5334000" cy="2520723"/>
             <wp:effectExtent b="0" l="0" r="0" t="0"/>
-            <wp:docPr descr="Audit complet avec svc-patch via JEA" title="" id="102" name="Picture"/>
+            <wp:docPr descr="Audit complet avec svc-patch via JEA" title="" id="103" name="Picture"/>
             <a:graphic>
               <a:graphicData uri="http://schemas.openxmlformats.org/drawingml/2006/picture">
                 <pic:pic>
                   <pic:nvPicPr>
-                    <pic:cNvPr descr="../screenshots/P7-3b_audit-complet-svc-patch-JEA.jpg" id="103" name="Picture"/>
+                    <pic:cNvPr descr="../screenshots/P7-3b_audit-complet-svc-patch-JEA.jpg" id="104" name="Picture"/>
                     <pic:cNvPicPr>
                       <a:picLocks noChangeArrowheads="1" noChangeAspect="1"/>
                     </pic:cNvPicPr>
                   </pic:nvPicPr>
                   <pic:blipFill>
-                    <a:blip r:embed="rId101"/>
+                    <a:blip r:embed="rId102"/>
                     <a:stretch>
                       <a:fillRect/>
                     </a:stretch>
@@ -5882,18 +5906,18 @@
           <wp:inline>
             <wp:extent cx="5334000" cy="544362"/>
             <wp:effectExtent b="0" l="0" r="0" t="0"/>
-            <wp:docPr descr="Credential chiffré DPAPI" title="" id="105" name="Picture"/>
+            <wp:docPr descr="Credential chiffré DPAPI" title="" id="106" name="Picture"/>
             <a:graphic>
               <a:graphicData uri="http://schemas.openxmlformats.org/drawingml/2006/picture">
                 <pic:pic>
                   <pic:nvPicPr>
-                    <pic:cNvPr descr="../screenshots/P7_credential-chiffre-DPAPI.jpg" id="106" name="Picture"/>
+                    <pic:cNvPr descr="../screenshots/P7_credential-chiffre-DPAPI.jpg" id="107" name="Picture"/>
                     <pic:cNvPicPr>
                       <a:picLocks noChangeArrowheads="1" noChangeAspect="1"/>
                     </pic:cNvPicPr>
                   </pic:nvPicPr>
                   <pic:blipFill>
-                    <a:blip r:embed="rId104"/>
+                    <a:blip r:embed="rId105"/>
                     <a:stretch>
                       <a:fillRect/>
                     </a:stretch>
@@ -5928,8 +5952,8 @@
         <w:t xml:space="preserve">Credential chiffré DPAPI</w:t>
       </w:r>
     </w:p>
-    <w:bookmarkEnd w:id="107"/>
-    <w:bookmarkStart w:id="111" w:name="protection-des-fichiers-produits-q4"/>
+    <w:bookmarkEnd w:id="108"/>
+    <w:bookmarkStart w:id="112" w:name="protection-des-fichiers-produits-q4"/>
     <w:p>
       <w:pPr>
         <w:pStyle w:val="Heading2"/>
@@ -6075,18 +6099,18 @@
           <wp:inline>
             <wp:extent cx="5334000" cy="2520723"/>
             <wp:effectExtent b="0" l="0" r="0" t="0"/>
-            <wp:docPr descr="ACL avant / après" title="" id="109" name="Picture"/>
+            <wp:docPr descr="ACL avant / après" title="" id="110" name="Picture"/>
             <a:graphic>
               <a:graphicData uri="http://schemas.openxmlformats.org/drawingml/2006/picture">
                 <pic:pic>
                   <pic:nvPicPr>
-                    <pic:cNvPr descr="../screenshots/P7-4_ACL-fichiers.jpg" id="110" name="Picture"/>
+                    <pic:cNvPr descr="../screenshots/P7-4_ACL-fichiers.jpg" id="111" name="Picture"/>
                     <pic:cNvPicPr>
                       <a:picLocks noChangeArrowheads="1" noChangeAspect="1"/>
                     </pic:cNvPicPr>
                   </pic:nvPicPr>
                   <pic:blipFill>
-                    <a:blip r:embed="rId108"/>
+                    <a:blip r:embed="rId109"/>
                     <a:stretch>
                       <a:fillRect/>
                     </a:stretch>
@@ -6171,8 +6195,8 @@
         <w:t xml:space="preserve">).</w:t>
       </w:r>
     </w:p>
-    <w:bookmarkEnd w:id="111"/>
-    <w:bookmarkStart w:id="115" w:name="pare-feu-winrm-q5"/>
+    <w:bookmarkEnd w:id="112"/>
+    <w:bookmarkStart w:id="116" w:name="pare-feu-winrm-q5"/>
     <w:p>
       <w:pPr>
         <w:pStyle w:val="Heading2"/>
@@ -6280,18 +6304,18 @@
           <wp:inline>
             <wp:extent cx="5334000" cy="2520723"/>
             <wp:effectExtent b="0" l="0" r="0" t="0"/>
-            <wp:docPr descr="Règles de pare-feu WinRM avant / après et vérification" title="" id="113" name="Picture"/>
+            <wp:docPr descr="Règles de pare-feu WinRM avant / après et vérification" title="" id="114" name="Picture"/>
             <a:graphic>
               <a:graphicData uri="http://schemas.openxmlformats.org/drawingml/2006/picture">
                 <pic:pic>
                   <pic:nvPicPr>
-                    <pic:cNvPr descr="../screenshots/P7-5_pare-feu-WinRM.jpg" id="114" name="Picture"/>
+                    <pic:cNvPr descr="../screenshots/P7-5_pare-feu-WinRM.jpg" id="115" name="Picture"/>
                     <pic:cNvPicPr>
                       <a:picLocks noChangeArrowheads="1" noChangeAspect="1"/>
                     </pic:cNvPicPr>
                   </pic:nvPicPr>
                   <pic:blipFill>
-                    <a:blip r:embed="rId112"/>
+                    <a:blip r:embed="rId113"/>
                     <a:stretch>
                       <a:fillRect/>
                     </a:stretch>
@@ -6375,8 +6399,8 @@
         <w:t xml:space="preserve">d’une mesure de sécurité, pas seulement l’appliquer.</w:t>
       </w:r>
     </w:p>
-    <w:bookmarkEnd w:id="115"/>
-    <w:bookmarkStart w:id="122" w:name="X326bd7ac1eb7066dfde915091867af039064a1e"/>
+    <w:bookmarkEnd w:id="116"/>
+    <w:bookmarkStart w:id="123" w:name="X326bd7ac1eb7066dfde915091867af039064a1e"/>
     <w:p>
       <w:pPr>
         <w:pStyle w:val="Heading2"/>
@@ -6495,18 +6519,18 @@
           <wp:inline>
             <wp:extent cx="5334000" cy="3007701"/>
             <wp:effectExtent b="0" l="0" r="0" t="0"/>
-            <wp:docPr descr="Méthodes d’authentification et protocole réellement utilisé" title="" id="117" name="Picture"/>
+            <wp:docPr descr="Méthodes d’authentification et protocole réellement utilisé" title="" id="118" name="Picture"/>
             <a:graphic>
               <a:graphicData uri="http://schemas.openxmlformats.org/drawingml/2006/picture">
                 <pic:pic>
                   <pic:nvPicPr>
-                    <pic:cNvPr descr="../screenshots/P7-6_authentification-NTLM.jpg" id="118" name="Picture"/>
+                    <pic:cNvPr descr="../screenshots/P7-6_authentification-NTLM.jpg" id="119" name="Picture"/>
                     <pic:cNvPicPr>
                       <a:picLocks noChangeArrowheads="1" noChangeAspect="1"/>
                     </pic:cNvPicPr>
                   </pic:nvPicPr>
                   <pic:blipFill>
-                    <a:blip r:embed="rId116"/>
+                    <a:blip r:embed="rId117"/>
                     <a:stretch>
                       <a:fillRect/>
                     </a:stretch>
@@ -6590,18 +6614,18 @@
           <wp:inline>
             <wp:extent cx="5334000" cy="2037669"/>
             <wp:effectExtent b="0" l="0" r="0" t="0"/>
-            <wp:docPr descr="Durcissement du client WinRM" title="" id="120" name="Picture"/>
+            <wp:docPr descr="Durcissement du client WinRM" title="" id="121" name="Picture"/>
             <a:graphic>
               <a:graphicData uri="http://schemas.openxmlformats.org/drawingml/2006/picture">
                 <pic:pic>
                   <pic:nvPicPr>
-                    <pic:cNvPr descr="../screenshots/P7-6b_durcissement-client-WinRM.jpg" id="121" name="Picture"/>
+                    <pic:cNvPr descr="../screenshots/P7-6b_durcissement-client-WinRM.jpg" id="122" name="Picture"/>
                     <pic:cNvPicPr>
                       <a:picLocks noChangeArrowheads="1" noChangeAspect="1"/>
                     </pic:cNvPicPr>
                   </pic:nvPicPr>
                   <pic:blipFill>
-                    <a:blip r:embed="rId119"/>
+                    <a:blip r:embed="rId120"/>
                     <a:stretch>
                       <a:fillRect/>
                     </a:stretch>
@@ -6742,8 +6766,8 @@
         <w:t xml:space="preserve">explicite et des mots de passe locaux uniques (LAPS).</w:t>
       </w:r>
     </w:p>
-    <w:bookmarkEnd w:id="122"/>
-    <w:bookmarkStart w:id="126" w:name="just-enough-administration-q7"/>
+    <w:bookmarkEnd w:id="123"/>
+    <w:bookmarkStart w:id="127" w:name="just-enough-administration-q7"/>
     <w:p>
       <w:pPr>
         <w:pStyle w:val="Heading2"/>
@@ -7075,18 +7099,18 @@
           <wp:inline>
             <wp:extent cx="5334000" cy="3007701"/>
             <wp:effectExtent b="0" l="0" r="0" t="0"/>
-            <wp:docPr descr="Point de terminaison JEA PatchAudit" title="" id="124" name="Picture"/>
+            <wp:docPr descr="Point de terminaison JEA PatchAudit" title="" id="125" name="Picture"/>
             <a:graphic>
               <a:graphicData uri="http://schemas.openxmlformats.org/drawingml/2006/picture">
                 <pic:pic>
                   <pic:nvPicPr>
-                    <pic:cNvPr descr="../screenshots/P7-7_JEA-PatchAudit.jpg" id="125" name="Picture"/>
+                    <pic:cNvPr descr="../screenshots/P7-7_JEA-PatchAudit.jpg" id="126" name="Picture"/>
                     <pic:cNvPicPr>
                       <a:picLocks noChangeArrowheads="1" noChangeAspect="1"/>
                     </pic:cNvPicPr>
                   </pic:nvPicPr>
                   <pic:blipFill>
-                    <a:blip r:embed="rId123"/>
+                    <a:blip r:embed="rId124"/>
                     <a:stretch>
                       <a:fillRect/>
                     </a:stretch>
@@ -7121,8 +7145,8 @@
         <w:t xml:space="preserve">Point de terminaison JEA PatchAudit</w:t>
       </w:r>
     </w:p>
-    <w:bookmarkEnd w:id="126"/>
-    <w:bookmarkStart w:id="127" w:name="Xa5007d34547534aeb13eaa27ecf966de56fe557"/>
+    <w:bookmarkEnd w:id="127"/>
+    <w:bookmarkStart w:id="128" w:name="Xa5007d34547534aeb13eaa27ecf966de56fe557"/>
     <w:p>
       <w:pPr>
         <w:pStyle w:val="Heading2"/>
@@ -7392,9 +7416,9 @@
         <w:t xml:space="preserve">par stratégie de groupe) garde une trace de toutes les commandes exécutées sur les postes.</w:t>
       </w:r>
     </w:p>
-    <w:bookmarkEnd w:id="127"/>
     <w:bookmarkEnd w:id="128"/>
-    <w:bookmarkStart w:id="129" w:name="tests-réalisés-et-résultats"/>
+    <w:bookmarkEnd w:id="129"/>
+    <w:bookmarkStart w:id="130" w:name="tests-réalisés-et-résultats"/>
     <w:p>
       <w:pPr>
         <w:pStyle w:val="Heading1"/>
@@ -7900,8 +7924,8 @@
         <w:t xml:space="preserve">. Action à mener : terminer l’installation de KB5128942 sur PC01 (puis redémarrer) et vérifier PC03.</w:t>
       </w:r>
     </w:p>
-    <w:bookmarkEnd w:id="129"/>
-    <w:bookmarkStart w:id="130" w:name="limites-et-améliorations-possibles"/>
+    <w:bookmarkEnd w:id="130"/>
+    <w:bookmarkStart w:id="131" w:name="limites-et-améliorations-possibles"/>
     <w:p>
       <w:pPr>
         <w:pStyle w:val="Heading1"/>
@@ -8121,8 +8145,8 @@
         <w:t xml:space="preserve">WinRM en HTTPS avec certificats et planification de l’audit (tâche planifiée sous le compte de service) seraient les prochaines étapes vers une utilisation en production.</w:t>
       </w:r>
     </w:p>
-    <w:bookmarkEnd w:id="130"/>
-    <w:bookmarkStart w:id="131" w:name="conclusion"/>
+    <w:bookmarkEnd w:id="131"/>
+    <w:bookmarkStart w:id="132" w:name="conclusion"/>
     <w:p>
       <w:pPr>
         <w:pStyle w:val="Heading1"/>
@@ -8163,8 +8187,8 @@
         <w:t xml:space="preserve">après application.</w:t>
       </w:r>
     </w:p>
-    <w:bookmarkEnd w:id="131"/>
-    <w:bookmarkStart w:id="132" w:name="annexe-utilisation"/>
+    <w:bookmarkEnd w:id="132"/>
+    <w:bookmarkStart w:id="133" w:name="annexe-utilisation"/>
     <w:p>
       <w:pPr>
         <w:pStyle w:val="Heading1"/>
@@ -8265,7 +8289,7 @@
         <w:t xml:space="preserve">.\PatchManager.ps1</w:t>
       </w:r>
     </w:p>
-    <w:bookmarkEnd w:id="132"/>
+    <w:bookmarkEnd w:id="133"/>
     <w:sectPr>
       <w:footerReference xmlns:r="http://schemas.openxmlformats.org/officeDocument/2006/relationships" r:id="rIdFooterPM" w:type="default"/>
       <w:titlePg/>

</xml_diff>

<commit_message>
Lien de la video de demonstration
Co-Authored-By: Claude Opus 5.5 <noreply@anthropic.com>
</commit_message>
<xml_diff>
--- a/rapport/Rapport_PatchManagement.docx
+++ b/rapport/Rapport_PatchManagement.docx
@@ -39,7 +39,7 @@
         <w:pStyle w:val="Date"/>
       </w:pPr>
       <w:r>
-        <w:t xml:space="preserve">Enseignant : Salim Benayoune — 31 octobre 2026 — Dépôt GitHub : https://github.com/LorisFGL/PatchManager</w:t>
+        <w:t xml:space="preserve">Enseignant : Salim Benayoune — 31 octobre 2026 — Dépôt GitHub : https://github.com/LorisFGL/PatchManager — Vidéo : https://youtu.be/YpbXMxrxyQs</w:t>
       </w:r>
     </w:p>
     <w:p>
@@ -278,7 +278,7 @@
       </w:r>
     </w:p>
     <w:bookmarkEnd w:id="9"/>
-    <w:bookmarkStart w:id="17" w:name="environnement-de-test"/>
+    <w:bookmarkStart w:id="18" w:name="environnement-de-test"/>
     <w:p>
       <w:pPr>
         <w:pStyle w:val="Heading1"/>
@@ -680,7 +680,7 @@
       </w:r>
     </w:p>
     <w:bookmarkEnd w:id="13"/>
-    <w:bookmarkStart w:id="15" w:name="organisation-du-code"/>
+    <w:bookmarkStart w:id="16" w:name="organisation-du-code"/>
     <w:p>
       <w:pPr>
         <w:pStyle w:val="Heading2"/>
@@ -707,6 +707,22 @@
             <w:bCs/>
           </w:rPr>
           <w:t xml:space="preserve">https://github.com/LorisFGL/PatchManager</w:t>
+        </w:r>
+      </w:hyperlink>
+      <w:r>
+        <w:t xml:space="preserve">. La vidéo de démonstration commentée est disponible ici :</w:t>
+      </w:r>
+      <w:r>
+        <w:t xml:space="preserve"> </w:t>
+      </w:r>
+      <w:hyperlink r:id="rId15">
+        <w:r>
+          <w:rPr>
+            <w:rStyle w:val="Hyperlink"/>
+            <w:b/>
+            <w:bCs/>
+          </w:rPr>
+          <w:t xml:space="preserve">https://youtu.be/YpbXMxrxyQs</w:t>
         </w:r>
       </w:hyperlink>
       <w:r>
@@ -1473,8 +1489,8 @@
         <w:t xml:space="preserve">.</w:t>
       </w:r>
     </w:p>
-    <w:bookmarkEnd w:id="15"/>
-    <w:bookmarkStart w:id="16" w:name="choix-techniques"/>
+    <w:bookmarkEnd w:id="16"/>
+    <w:bookmarkStart w:id="17" w:name="choix-techniques"/>
     <w:p>
       <w:pPr>
         <w:pStyle w:val="Heading2"/>
@@ -1785,9 +1801,9 @@
         <w:t xml:space="preserve">: scripts enregistrés en UTF-8 avec BOM pour que Windows PowerShell 5.1 affiche correctement les accents.</w:t>
       </w:r>
     </w:p>
-    <w:bookmarkEnd w:id="16"/>
     <w:bookmarkEnd w:id="17"/>
-    <w:bookmarkStart w:id="55" w:name="partie-1-préparation-de-lenvironnement"/>
+    <w:bookmarkEnd w:id="18"/>
+    <w:bookmarkStart w:id="56" w:name="partie-1-préparation-de-lenvironnement"/>
     <w:p>
       <w:pPr>
         <w:pStyle w:val="Heading1"/>
@@ -1796,7 +1812,7 @@
         <w:t xml:space="preserve">3. Partie 1 — Préparation de l’environnement</w:t>
       </w:r>
     </w:p>
-    <w:bookmarkStart w:id="21" w:name="connectivité-entre-les-postes-q1"/>
+    <w:bookmarkStart w:id="22" w:name="connectivité-entre-les-postes-q1"/>
     <w:p>
       <w:pPr>
         <w:pStyle w:val="Heading2"/>
@@ -1847,18 +1863,18 @@
           <wp:inline>
             <wp:extent cx="5334000" cy="1979717"/>
             <wp:effectExtent b="0" l="0" r="0" t="0"/>
-            <wp:docPr descr="Connectivité entre PC01 et PC02 (Test-Connection)" title="" id="19" name="Picture"/>
+            <wp:docPr descr="Connectivité entre PC01 et PC02 (Test-Connection)" title="" id="20" name="Picture"/>
             <a:graphic>
               <a:graphicData uri="http://schemas.openxmlformats.org/drawingml/2006/picture">
                 <pic:pic>
                   <pic:nvPicPr>
-                    <pic:cNvPr descr="../screenshots/P1-1_connectivite.jpg" id="20" name="Picture"/>
+                    <pic:cNvPr descr="../screenshots/P1-1_connectivite.jpg" id="21" name="Picture"/>
                     <pic:cNvPicPr>
                       <a:picLocks noChangeArrowheads="1" noChangeAspect="1"/>
                     </pic:cNvPicPr>
                   </pic:nvPicPr>
                   <pic:blipFill>
-                    <a:blip r:embed="rId18"/>
+                    <a:blip r:embed="rId19"/>
                     <a:stretch>
                       <a:fillRect/>
                     </a:stretch>
@@ -1893,8 +1909,8 @@
         <w:t xml:space="preserve">Connectivité entre PC01 et PC02 (Test-Connection)</w:t>
       </w:r>
     </w:p>
-    <w:bookmarkEnd w:id="21"/>
-    <w:bookmarkStart w:id="25" w:name="Xe84f2ac2f0c804abd880fb184b8818a27e99ac2"/>
+    <w:bookmarkEnd w:id="22"/>
+    <w:bookmarkStart w:id="26" w:name="Xe84f2ac2f0c804abd880fb184b8818a27e99ac2"/>
     <w:p>
       <w:pPr>
         <w:pStyle w:val="Heading2"/>
@@ -1987,18 +2003,18 @@
           <wp:inline>
             <wp:extent cx="5334000" cy="1906235"/>
             <wp:effectExtent b="0" l="0" r="0" t="0"/>
-            <wp:docPr descr="computers.txt et résultat de 01-Test-Environment.ps1" title="" id="23" name="Picture"/>
+            <wp:docPr descr="computers.txt et résultat de 01-Test-Environment.ps1" title="" id="24" name="Picture"/>
             <a:graphic>
               <a:graphicData uri="http://schemas.openxmlformats.org/drawingml/2006/picture">
                 <pic:pic>
                   <pic:nvPicPr>
-                    <pic:cNvPr descr="../screenshots/P1-2-3_computers-txt_disponibilite.jpg" id="24" name="Picture"/>
+                    <pic:cNvPr descr="../screenshots/P1-2-3_computers-txt_disponibilite.jpg" id="25" name="Picture"/>
                     <pic:cNvPicPr>
                       <a:picLocks noChangeArrowheads="1" noChangeAspect="1"/>
                     </pic:cNvPicPr>
                   </pic:nvPicPr>
                   <pic:blipFill>
-                    <a:blip r:embed="rId22"/>
+                    <a:blip r:embed="rId23"/>
                     <a:stretch>
                       <a:fillRect/>
                     </a:stretch>
@@ -2033,8 +2049,8 @@
         <w:t xml:space="preserve">computers.txt et résultat de 01-Test-Environment.ps1</w:t>
       </w:r>
     </w:p>
-    <w:bookmarkEnd w:id="25"/>
-    <w:bookmarkStart w:id="29" w:name="Xdaceeeda3c0f7433809a1cb741dc8e3d0f6a715"/>
+    <w:bookmarkEnd w:id="26"/>
+    <w:bookmarkStart w:id="30" w:name="Xdaceeeda3c0f7433809a1cb741dc8e3d0f6a715"/>
     <w:p>
       <w:pPr>
         <w:pStyle w:val="Heading2"/>
@@ -2118,18 +2134,18 @@
           <wp:inline>
             <wp:extent cx="5334000" cy="1667111"/>
             <wp:effectExtent b="0" l="0" r="0" t="0"/>
-            <wp:docPr descr="Service WinRM, écouteur et Test-WSMan" title="" id="27" name="Picture"/>
+            <wp:docPr descr="Service WinRM, écouteur et Test-WSMan" title="" id="28" name="Picture"/>
             <a:graphic>
               <a:graphicData uri="http://schemas.openxmlformats.org/drawingml/2006/picture">
                 <pic:pic>
                   <pic:nvPicPr>
-                    <pic:cNvPr descr="../screenshots/P1-4_WinRM-Test-WSMan.jpg" id="28" name="Picture"/>
+                    <pic:cNvPr descr="../screenshots/P1-4_WinRM-Test-WSMan.jpg" id="29" name="Picture"/>
                     <pic:cNvPicPr>
                       <a:picLocks noChangeArrowheads="1" noChangeAspect="1"/>
                     </pic:cNvPicPr>
                   </pic:nvPicPr>
                   <pic:blipFill>
-                    <a:blip r:embed="rId26"/>
+                    <a:blip r:embed="rId27"/>
                     <a:stretch>
                       <a:fillRect/>
                     </a:stretch>
@@ -2164,8 +2180,8 @@
         <w:t xml:space="preserve">Service WinRM, écouteur et Test-WSMan</w:t>
       </w:r>
     </w:p>
-    <w:bookmarkEnd w:id="29"/>
-    <w:bookmarkStart w:id="33" w:name="session-interactive-enter-pssession-q5"/>
+    <w:bookmarkEnd w:id="30"/>
+    <w:bookmarkStart w:id="34" w:name="session-interactive-enter-pssession-q5"/>
     <w:p>
       <w:pPr>
         <w:pStyle w:val="Heading2"/>
@@ -2255,18 +2271,18 @@
           <wp:inline>
             <wp:extent cx="5334000" cy="2471334"/>
             <wp:effectExtent b="0" l="0" r="0" t="0"/>
-            <wp:docPr descr="Commandes exécutées dans une session Enter-PSSession sur PC02" title="" id="31" name="Picture"/>
+            <wp:docPr descr="Commandes exécutées dans une session Enter-PSSession sur PC02" title="" id="32" name="Picture"/>
             <a:graphic>
               <a:graphicData uri="http://schemas.openxmlformats.org/drawingml/2006/picture">
                 <pic:pic>
                   <pic:nvPicPr>
-                    <pic:cNvPr descr="../screenshots/P1-5_Enter-PSSession.jpg" id="32" name="Picture"/>
+                    <pic:cNvPr descr="../screenshots/P1-5_Enter-PSSession.jpg" id="33" name="Picture"/>
                     <pic:cNvPicPr>
                       <a:picLocks noChangeArrowheads="1" noChangeAspect="1"/>
                     </pic:cNvPicPr>
                   </pic:nvPicPr>
                   <pic:blipFill>
-                    <a:blip r:embed="rId30"/>
+                    <a:blip r:embed="rId31"/>
                     <a:stretch>
                       <a:fillRect/>
                     </a:stretch>
@@ -2301,8 +2317,8 @@
         <w:t xml:space="preserve">Commandes exécutées dans une session Enter-PSSession sur PC02</w:t>
       </w:r>
     </w:p>
-    <w:bookmarkEnd w:id="33"/>
-    <w:bookmarkStart w:id="37" w:name="X56d4623f3e1e1389cf82821dd20af7a6b49b111"/>
+    <w:bookmarkEnd w:id="34"/>
+    <w:bookmarkStart w:id="38" w:name="X56d4623f3e1e1389cf82821dd20af7a6b49b111"/>
     <w:p>
       <w:pPr>
         <w:pStyle w:val="Heading2"/>
@@ -2365,18 +2381,18 @@
           <wp:inline>
             <wp:extent cx="5334000" cy="873248"/>
             <wp:effectExtent b="0" l="0" r="0" t="0"/>
-            <wp:docPr descr="Invoke-Command sur les deux postes en une commande" title="" id="35" name="Picture"/>
+            <wp:docPr descr="Invoke-Command sur les deux postes en une commande" title="" id="36" name="Picture"/>
             <a:graphic>
               <a:graphicData uri="http://schemas.openxmlformats.org/drawingml/2006/picture">
                 <pic:pic>
                   <pic:nvPicPr>
-                    <pic:cNvPr descr="../screenshots/P1-6_Invoke-Command.jpg" id="36" name="Picture"/>
+                    <pic:cNvPr descr="../screenshots/P1-6_Invoke-Command.jpg" id="37" name="Picture"/>
                     <pic:cNvPicPr>
                       <a:picLocks noChangeArrowheads="1" noChangeAspect="1"/>
                     </pic:cNvPicPr>
                   </pic:nvPicPr>
                   <pic:blipFill>
-                    <a:blip r:embed="rId34"/>
+                    <a:blip r:embed="rId35"/>
                     <a:stretch>
                       <a:fillRect/>
                     </a:stretch>
@@ -2411,8 +2427,8 @@
         <w:t xml:space="preserve">Invoke-Command sur les deux postes en une commande</w:t>
       </w:r>
     </w:p>
-    <w:bookmarkEnd w:id="37"/>
-    <w:bookmarkStart w:id="53" w:name="X04d1c6b906a5cb21d5fa1b89e4c71aab570b8eb"/>
+    <w:bookmarkEnd w:id="38"/>
+    <w:bookmarkStart w:id="54" w:name="X04d1c6b906a5cb21d5fa1b89e4c71aab570b8eb"/>
     <w:p>
       <w:pPr>
         <w:pStyle w:val="Heading2"/>
@@ -2454,18 +2470,18 @@
           <wp:inline>
             <wp:extent cx="5334000" cy="699355"/>
             <wp:effectExtent b="0" l="0" r="0" t="0"/>
-            <wp:docPr descr="Accès refusé vers PC02, OK vers PC01" title="" id="39" name="Picture"/>
+            <wp:docPr descr="Accès refusé vers PC02, OK vers PC01" title="" id="40" name="Picture"/>
             <a:graphic>
               <a:graphicData uri="http://schemas.openxmlformats.org/drawingml/2006/picture">
                 <pic:pic>
                   <pic:nvPicPr>
-                    <pic:cNvPr descr="../screenshots/DEPANNAGE-00_acces-refuse-PC02.jpg" id="40" name="Picture"/>
+                    <pic:cNvPr descr="../screenshots/DEPANNAGE-00_acces-refuse-PC02.jpg" id="41" name="Picture"/>
                     <pic:cNvPicPr>
                       <a:picLocks noChangeArrowheads="1" noChangeAspect="1"/>
                     </pic:cNvPicPr>
                   </pic:nvPicPr>
                   <pic:blipFill>
-                    <a:blip r:embed="rId38"/>
+                    <a:blip r:embed="rId39"/>
                     <a:stretch>
                       <a:fillRect/>
                     </a:stretch>
@@ -2565,18 +2581,18 @@
           <wp:inline>
             <wp:extent cx="5334000" cy="1994933"/>
             <wp:effectExtent b="0" l="0" r="0" t="0"/>
-            <wp:docPr descr="Événements 4625 sur PC02" title="" id="42" name="Picture"/>
+            <wp:docPr descr="Événements 4625 sur PC02" title="" id="43" name="Picture"/>
             <a:graphic>
               <a:graphicData uri="http://schemas.openxmlformats.org/drawingml/2006/picture">
                 <pic:pic>
                   <pic:nvPicPr>
-                    <pic:cNvPr descr="../screenshots/DEPANNAGE-0_event4625-0xC000006D.jpg" id="43" name="Picture"/>
+                    <pic:cNvPr descr="../screenshots/DEPANNAGE-0_event4625-0xC000006D.jpg" id="44" name="Picture"/>
                     <pic:cNvPicPr>
                       <a:picLocks noChangeArrowheads="1" noChangeAspect="1"/>
                     </pic:cNvPicPr>
                   </pic:nvPicPr>
                   <pic:blipFill>
-                    <a:blip r:embed="rId41"/>
+                    <a:blip r:embed="rId42"/>
                     <a:stretch>
                       <a:fillRect/>
                     </a:stretch>
@@ -2674,18 +2690,18 @@
           <wp:inline>
             <wp:extent cx="5334000" cy="704398"/>
             <wp:effectExtent b="0" l="0" r="0" t="0"/>
-            <wp:docPr descr="SID identique sur PC02…" title="" id="45" name="Picture"/>
+            <wp:docPr descr="SID identique sur PC02…" title="" id="46" name="Picture"/>
             <a:graphic>
               <a:graphicData uri="http://schemas.openxmlformats.org/drawingml/2006/picture">
                 <pic:pic>
                   <pic:nvPicPr>
-                    <pic:cNvPr descr="../screenshots/DEPANNAGE-1_SID-PC02.jpg" id="46" name="Picture"/>
+                    <pic:cNvPr descr="../screenshots/DEPANNAGE-1_SID-PC02.jpg" id="47" name="Picture"/>
                     <pic:cNvPicPr>
                       <a:picLocks noChangeArrowheads="1" noChangeAspect="1"/>
                     </pic:cNvPicPr>
                   </pic:nvPicPr>
                   <pic:blipFill>
-                    <a:blip r:embed="rId44"/>
+                    <a:blip r:embed="rId45"/>
                     <a:stretch>
                       <a:fillRect/>
                     </a:stretch>
@@ -2729,18 +2745,18 @@
           <wp:inline>
             <wp:extent cx="5334000" cy="427497"/>
             <wp:effectExtent b="0" l="0" r="0" t="0"/>
-            <wp:docPr descr="…et sur PC01" title="" id="48" name="Picture"/>
+            <wp:docPr descr="…et sur PC01" title="" id="49" name="Picture"/>
             <a:graphic>
               <a:graphicData uri="http://schemas.openxmlformats.org/drawingml/2006/picture">
                 <pic:pic>
                   <pic:nvPicPr>
-                    <pic:cNvPr descr="../screenshots/DEPANNAGE-2_SID-PC01.jpg" id="49" name="Picture"/>
+                    <pic:cNvPr descr="../screenshots/DEPANNAGE-2_SID-PC01.jpg" id="50" name="Picture"/>
                     <pic:cNvPicPr>
                       <a:picLocks noChangeArrowheads="1" noChangeAspect="1"/>
                     </pic:cNvPicPr>
                   </pic:nvPicPr>
                   <pic:blipFill>
-                    <a:blip r:embed="rId47"/>
+                    <a:blip r:embed="rId48"/>
                     <a:stretch>
                       <a:fillRect/>
                     </a:stretch>
@@ -2804,18 +2820,18 @@
           <wp:inline>
             <wp:extent cx="5334000" cy="464976"/>
             <wp:effectExtent b="0" l="0" r="0" t="0"/>
-            <wp:docPr descr="Après Sysprep : SID différents, accès OK" title="" id="51" name="Picture"/>
+            <wp:docPr descr="Après Sysprep : SID différents, accès OK" title="" id="52" name="Picture"/>
             <a:graphic>
               <a:graphicData uri="http://schemas.openxmlformats.org/drawingml/2006/picture">
                 <pic:pic>
                   <pic:nvPicPr>
-                    <pic:cNvPr descr="../screenshots/DEPANNAGE-3_resolu-apres-sysprep.jpg" id="52" name="Picture"/>
+                    <pic:cNvPr descr="../screenshots/DEPANNAGE-3_resolu-apres-sysprep.jpg" id="53" name="Picture"/>
                     <pic:cNvPicPr>
                       <a:picLocks noChangeArrowheads="1" noChangeAspect="1"/>
                     </pic:cNvPicPr>
                   </pic:nvPicPr>
                   <pic:blipFill>
-                    <a:blip r:embed="rId50"/>
+                    <a:blip r:embed="rId51"/>
                     <a:stretch>
                       <a:fillRect/>
                     </a:stretch>
@@ -2868,8 +2884,8 @@
         <w:t xml:space="preserve">: on ne déploie jamais un clone Windows sans Sysprep ; c’est la procédure normale de préparation d’une image (master).</w:t>
       </w:r>
     </w:p>
-    <w:bookmarkEnd w:id="53"/>
-    <w:bookmarkStart w:id="54" w:name="réponses-aux-questions-de-la-partie-1"/>
+    <w:bookmarkEnd w:id="54"/>
+    <w:bookmarkStart w:id="55" w:name="réponses-aux-questions-de-la-partie-1"/>
     <w:p>
       <w:pPr>
         <w:pStyle w:val="Heading2"/>
@@ -3229,9 +3245,9 @@
         <w:t xml:space="preserve">désactive la vérification de l’identité des serveurs ; des méthodes faibles (Basic, trafic non chiffré) exposent les mots de passe ; un compte d’administration unique utilisé partout devient une cible de choix ; et sans journalisation, les actions ne sont pas traçables. Ces risques sont traités en partie 7.</w:t>
       </w:r>
     </w:p>
-    <w:bookmarkEnd w:id="54"/>
     <w:bookmarkEnd w:id="55"/>
-    <w:bookmarkStart w:id="62" w:name="partie-2-inventaire-du-parc"/>
+    <w:bookmarkEnd w:id="56"/>
+    <w:bookmarkStart w:id="63" w:name="partie-2-inventaire-du-parc"/>
     <w:p>
       <w:pPr>
         <w:pStyle w:val="Heading1"/>
@@ -3318,18 +3334,18 @@
           <wp:inline>
             <wp:extent cx="5334000" cy="1088725"/>
             <wp:effectExtent b="0" l="0" r="0" t="0"/>
-            <wp:docPr descr="Tableau récapitulatif de l’inventaire" title="" id="57" name="Picture"/>
+            <wp:docPr descr="Tableau récapitulatif de l’inventaire" title="" id="58" name="Picture"/>
             <a:graphic>
               <a:graphicData uri="http://schemas.openxmlformats.org/drawingml/2006/picture">
                 <pic:pic>
                   <pic:nvPicPr>
-                    <pic:cNvPr descr="../screenshots/P2-1_inventaire-tableau.jpg" id="58" name="Picture"/>
+                    <pic:cNvPr descr="../screenshots/P2-1_inventaire-tableau.jpg" id="59" name="Picture"/>
                     <pic:cNvPicPr>
                       <a:picLocks noChangeArrowheads="1" noChangeAspect="1"/>
                     </pic:cNvPicPr>
                   </pic:nvPicPr>
                   <pic:blipFill>
-                    <a:blip r:embed="rId56"/>
+                    <a:blip r:embed="rId57"/>
                     <a:stretch>
                       <a:fillRect/>
                     </a:stretch>
@@ -3412,18 +3428,18 @@
           <wp:inline>
             <wp:extent cx="5334000" cy="4147704"/>
             <wp:effectExtent b="0" l="0" r="0" t="0"/>
-            <wp:docPr descr="Détail de Inventory.csv" title="" id="60" name="Picture"/>
+            <wp:docPr descr="Détail de Inventory.csv" title="" id="61" name="Picture"/>
             <a:graphic>
               <a:graphicData uri="http://schemas.openxmlformats.org/drawingml/2006/picture">
                 <pic:pic>
                   <pic:nvPicPr>
-                    <pic:cNvPr descr="../screenshots/P2-2_inventaire-detail-csv.jpg" id="61" name="Picture"/>
+                    <pic:cNvPr descr="../screenshots/P2-2_inventaire-detail-csv.jpg" id="62" name="Picture"/>
                     <pic:cNvPicPr>
                       <a:picLocks noChangeArrowheads="1" noChangeAspect="1"/>
                     </pic:cNvPicPr>
                   </pic:nvPicPr>
                   <pic:blipFill>
-                    <a:blip r:embed="rId59"/>
+                    <a:blip r:embed="rId60"/>
                     <a:stretch>
                       <a:fillRect/>
                     </a:stretch>
@@ -3466,8 +3482,8 @@
         <w:t xml:space="preserve">Remarque : les VM étant sous VMware sur Apple Silicon, le modèle remonte « VMware20,1 » et l’architecture « Processeur ARM 64 bits ».</w:t>
       </w:r>
     </w:p>
-    <w:bookmarkEnd w:id="62"/>
-    <w:bookmarkStart w:id="69" w:name="partie-3-inventaire-des-correctifs"/>
+    <w:bookmarkEnd w:id="63"/>
+    <w:bookmarkStart w:id="70" w:name="partie-3-inventaire-des-correctifs"/>
     <w:p>
       <w:pPr>
         <w:pStyle w:val="Heading1"/>
@@ -3551,18 +3567,18 @@
           <wp:inline>
             <wp:extent cx="5334000" cy="2561544"/>
             <wp:effectExtent b="0" l="0" r="0" t="0"/>
-            <wp:docPr descr="Correctifs locaux et synthèse par poste" title="" id="64" name="Picture"/>
+            <wp:docPr descr="Correctifs locaux et synthèse par poste" title="" id="65" name="Picture"/>
             <a:graphic>
               <a:graphicData uri="http://schemas.openxmlformats.org/drawingml/2006/picture">
                 <pic:pic>
                   <pic:nvPicPr>
-                    <pic:cNvPr descr="../screenshots/P3-1_correctifs-local-et-synthese.jpg" id="65" name="Picture"/>
+                    <pic:cNvPr descr="../screenshots/P3-1_correctifs-local-et-synthese.jpg" id="66" name="Picture"/>
                     <pic:cNvPicPr>
                       <a:picLocks noChangeArrowheads="1" noChangeAspect="1"/>
                     </pic:cNvPicPr>
                   </pic:nvPicPr>
                   <pic:blipFill>
-                    <a:blip r:embed="rId63"/>
+                    <a:blip r:embed="rId64"/>
                     <a:stretch>
                       <a:fillRect/>
                     </a:stretch>
@@ -3673,18 +3689,18 @@
           <wp:inline>
             <wp:extent cx="5334000" cy="1922008"/>
             <wp:effectExtent b="0" l="0" r="0" t="0"/>
-            <wp:docPr descr="PatchesInventory.csv et PatchSummary.csv" title="" id="67" name="Picture"/>
+            <wp:docPr descr="PatchesInventory.csv et PatchSummary.csv" title="" id="68" name="Picture"/>
             <a:graphic>
               <a:graphicData uri="http://schemas.openxmlformats.org/drawingml/2006/picture">
                 <pic:pic>
                   <pic:nvPicPr>
-                    <pic:cNvPr descr="../screenshots/P3-2_PatchesInventory-csv.jpg" id="68" name="Picture"/>
+                    <pic:cNvPr descr="../screenshots/P3-2_PatchesInventory-csv.jpg" id="69" name="Picture"/>
                     <pic:cNvPicPr>
                       <a:picLocks noChangeArrowheads="1" noChangeAspect="1"/>
                     </pic:cNvPicPr>
                   </pic:nvPicPr>
                   <pic:blipFill>
-                    <a:blip r:embed="rId66"/>
+                    <a:blip r:embed="rId67"/>
                     <a:stretch>
                       <a:fillRect/>
                     </a:stretch>
@@ -3743,8 +3759,8 @@
         <w:t xml:space="preserve">: PC02 l’a reçue lors de sa réinstallation (phase OOBE après Sysprep), tandis que sur PC01 l’installation lancée depuis Windows Update n’était pas encore terminée au moment de l’audit. Ce décalage réel entre deux postes est exactement le type de situation que le Patch Management doit détecter.</w:t>
       </w:r>
     </w:p>
-    <w:bookmarkEnd w:id="69"/>
-    <w:bookmarkStart w:id="73" w:name="partie-4-contrôle-de-conformité"/>
+    <w:bookmarkEnd w:id="70"/>
+    <w:bookmarkStart w:id="74" w:name="partie-4-contrôle-de-conformité"/>
     <w:p>
       <w:pPr>
         <w:pStyle w:val="Heading1"/>
@@ -3942,18 +3958,18 @@
           <wp:inline>
             <wp:extent cx="5334000" cy="1922008"/>
             <wp:effectExtent b="0" l="0" r="0" t="0"/>
-            <wp:docPr descr="required-patches.txt et contrôle de conformité" title="" id="71" name="Picture"/>
+            <wp:docPr descr="required-patches.txt et contrôle de conformité" title="" id="72" name="Picture"/>
             <a:graphic>
               <a:graphicData uri="http://schemas.openxmlformats.org/drawingml/2006/picture">
                 <pic:pic>
                   <pic:nvPicPr>
-                    <pic:cNvPr descr="../screenshots/P4_conformite.jpg" id="72" name="Picture"/>
+                    <pic:cNvPr descr="../screenshots/P4_conformite.jpg" id="73" name="Picture"/>
                     <pic:cNvPicPr>
                       <a:picLocks noChangeArrowheads="1" noChangeAspect="1"/>
                     </pic:cNvPicPr>
                   </pic:nvPicPr>
                   <pic:blipFill>
-                    <a:blip r:embed="rId70"/>
+                    <a:blip r:embed="rId71"/>
                     <a:stretch>
                       <a:fillRect/>
                     </a:stretch>
@@ -4048,8 +4064,8 @@
         <w:t xml:space="preserve">: un poste « conforme » à une liste périmée peut rester vulnérable. Ici, la politique a d’ailleurs été mise à jour le 27/10 pour inclure la cumulative d’octobre, ce qui a rendu PC01 non conforme.</w:t>
       </w:r>
     </w:p>
-    <w:bookmarkEnd w:id="73"/>
-    <w:bookmarkStart w:id="83" w:name="partie-5-rapport-de-sécurité"/>
+    <w:bookmarkEnd w:id="74"/>
+    <w:bookmarkStart w:id="84" w:name="partie-5-rapport-de-sécurité"/>
     <w:p>
       <w:pPr>
         <w:pStyle w:val="Heading1"/>
@@ -4127,18 +4143,18 @@
           <wp:inline>
             <wp:extent cx="5334000" cy="2241776"/>
             <wp:effectExtent b="0" l="0" r="0" t="0"/>
-            <wp:docPr descr="Génération du rapport et journal" title="" id="75" name="Picture"/>
+            <wp:docPr descr="Génération du rapport et journal" title="" id="76" name="Picture"/>
             <a:graphic>
               <a:graphicData uri="http://schemas.openxmlformats.org/drawingml/2006/picture">
                 <pic:pic>
                   <pic:nvPicPr>
-                    <pic:cNvPr descr="../screenshots/P5-1_rapport-et-journal.jpg" id="76" name="Picture"/>
+                    <pic:cNvPr descr="../screenshots/P5-1_rapport-et-journal.jpg" id="77" name="Picture"/>
                     <pic:cNvPicPr>
                       <a:picLocks noChangeArrowheads="1" noChangeAspect="1"/>
                     </pic:cNvPicPr>
                   </pic:nvPicPr>
                   <pic:blipFill>
-                    <a:blip r:embed="rId74"/>
+                    <a:blip r:embed="rId75"/>
                     <a:stretch>
                       <a:fillRect/>
                     </a:stretch>
@@ -4215,18 +4231,18 @@
           <wp:inline>
             <wp:extent cx="5334000" cy="2333625"/>
             <wp:effectExtent b="0" l="0" r="0" t="0"/>
-            <wp:docPr descr="Rapport HTML dans Microsoft Edge" title="" id="78" name="Picture"/>
+            <wp:docPr descr="Rapport HTML dans Microsoft Edge" title="" id="79" name="Picture"/>
             <a:graphic>
               <a:graphicData uri="http://schemas.openxmlformats.org/drawingml/2006/picture">
                 <pic:pic>
                   <pic:nvPicPr>
-                    <pic:cNvPr descr="../screenshots/P5-2_rapport-HTML.jpg" id="79" name="Picture"/>
+                    <pic:cNvPr descr="../screenshots/P5-2_rapport-HTML.jpg" id="80" name="Picture"/>
                     <pic:cNvPicPr>
                       <a:picLocks noChangeArrowheads="1" noChangeAspect="1"/>
                     </pic:cNvPicPr>
                   </pic:nvPicPr>
                   <pic:blipFill>
-                    <a:blip r:embed="rId77"/>
+                    <a:blip r:embed="rId78"/>
                     <a:stretch>
                       <a:fillRect/>
                     </a:stretch>
@@ -4317,18 +4333,18 @@
           <wp:inline>
             <wp:extent cx="5334000" cy="1813151"/>
             <wp:effectExtent b="0" l="0" r="0" t="0"/>
-            <wp:docPr descr="Journal d’un audit complet, du début à la fin" title="" id="81" name="Picture"/>
+            <wp:docPr descr="Journal d’un audit complet, du début à la fin" title="" id="82" name="Picture"/>
             <a:graphic>
               <a:graphicData uri="http://schemas.openxmlformats.org/drawingml/2006/picture">
                 <pic:pic>
                   <pic:nvPicPr>
-                    <pic:cNvPr descr="../screenshots/P5-3_journal-audit-complet.jpg" id="82" name="Picture"/>
+                    <pic:cNvPr descr="../screenshots/P5-3_journal-audit-complet.jpg" id="83" name="Picture"/>
                     <pic:cNvPicPr>
                       <a:picLocks noChangeArrowheads="1" noChangeAspect="1"/>
                     </pic:cNvPicPr>
                   </pic:nvPicPr>
                   <pic:blipFill>
-                    <a:blip r:embed="rId80"/>
+                    <a:blip r:embed="rId81"/>
                     <a:stretch>
                       <a:fillRect/>
                     </a:stretch>
@@ -4425,8 +4441,8 @@
         <w:t xml:space="preserve">était appelé avec une syntaxe invalide pour la somme des KB manquantes.</w:t>
       </w:r>
     </w:p>
-    <w:bookmarkEnd w:id="83"/>
-    <w:bookmarkStart w:id="93" w:name="partie-6-notification"/>
+    <w:bookmarkEnd w:id="84"/>
+    <w:bookmarkStart w:id="94" w:name="partie-6-notification"/>
     <w:p>
       <w:pPr>
         <w:pStyle w:val="Heading1"/>
@@ -4622,18 +4638,18 @@
           <wp:inline>
             <wp:extent cx="5334000" cy="853848"/>
             <wp:effectExtent b="0" l="0" r="0" t="0"/>
-            <wp:docPr descr="Échec d’envoi tracé dans le journal" title="" id="85" name="Picture"/>
+            <wp:docPr descr="Échec d’envoi tracé dans le journal" title="" id="86" name="Picture"/>
             <a:graphic>
               <a:graphicData uri="http://schemas.openxmlformats.org/drawingml/2006/picture">
                 <pic:pic>
                   <pic:nvPicPr>
-                    <pic:cNvPr descr="../screenshots/P6-2_notification-echec-journal.jpg" id="86" name="Picture"/>
+                    <pic:cNvPr descr="../screenshots/P6-2_notification-echec-journal.jpg" id="87" name="Picture"/>
                     <pic:cNvPicPr>
                       <a:picLocks noChangeArrowheads="1" noChangeAspect="1"/>
                     </pic:cNvPicPr>
                   </pic:nvPicPr>
                   <pic:blipFill>
-                    <a:blip r:embed="rId84"/>
+                    <a:blip r:embed="rId85"/>
                     <a:stretch>
                       <a:fillRect/>
                     </a:stretch>
@@ -4710,18 +4726,18 @@
           <wp:inline>
             <wp:extent cx="5334000" cy="604847"/>
             <wp:effectExtent b="0" l="0" r="0" t="0"/>
-            <wp:docPr descr="Message reçu par le serveur SMTP de test" title="" id="88" name="Picture"/>
+            <wp:docPr descr="Message reçu par le serveur SMTP de test" title="" id="89" name="Picture"/>
             <a:graphic>
               <a:graphicData uri="http://schemas.openxmlformats.org/drawingml/2006/picture">
                 <pic:pic>
                   <pic:nvPicPr>
-                    <pic:cNvPr descr="../screenshots/P6-3_serveur-SMTP-test-message-recu.jpg" id="89" name="Picture"/>
+                    <pic:cNvPr descr="../screenshots/P6-3_serveur-SMTP-test-message-recu.jpg" id="90" name="Picture"/>
                     <pic:cNvPicPr>
                       <a:picLocks noChangeArrowheads="1" noChangeAspect="1"/>
                     </pic:cNvPicPr>
                   </pic:nvPicPr>
                   <pic:blipFill>
-                    <a:blip r:embed="rId87"/>
+                    <a:blip r:embed="rId88"/>
                     <a:stretch>
                       <a:fillRect/>
                     </a:stretch>
@@ -4765,18 +4781,18 @@
           <wp:inline>
             <wp:extent cx="5334000" cy="2132919"/>
             <wp:effectExtent b="0" l="0" r="0" t="0"/>
-            <wp:docPr descr="Contenu du message reçu (objet, détail, pièce jointe)" title="" id="91" name="Picture"/>
+            <wp:docPr descr="Contenu du message reçu (objet, détail, pièce jointe)" title="" id="92" name="Picture"/>
             <a:graphic>
               <a:graphicData uri="http://schemas.openxmlformats.org/drawingml/2006/picture">
                 <pic:pic>
                   <pic:nvPicPr>
-                    <pic:cNvPr descr="../screenshots/P6-1_contenu-notification.jpg" id="92" name="Picture"/>
+                    <pic:cNvPr descr="../screenshots/P6-1_contenu-notification.jpg" id="93" name="Picture"/>
                     <pic:cNvPicPr>
                       <a:picLocks noChangeArrowheads="1" noChangeAspect="1"/>
                     </pic:cNvPicPr>
                   </pic:nvPicPr>
                   <pic:blipFill>
-                    <a:blip r:embed="rId90"/>
+                    <a:blip r:embed="rId91"/>
                     <a:stretch>
                       <a:fillRect/>
                     </a:stretch>
@@ -5156,8 +5172,8 @@
         <w:t xml:space="preserve">, Azure Key Vault) plutôt que dans un fichier.</w:t>
       </w:r>
     </w:p>
-    <w:bookmarkEnd w:id="93"/>
-    <w:bookmarkStart w:id="129" w:name="partie-7-sécurisation-de-la-solution"/>
+    <w:bookmarkEnd w:id="94"/>
+    <w:bookmarkStart w:id="130" w:name="partie-7-sécurisation-de-la-solution"/>
     <w:p>
       <w:pPr>
         <w:pStyle w:val="Heading1"/>
@@ -5166,7 +5182,7 @@
         <w:t xml:space="preserve">9. Partie 7 — Sécurisation de la solution</w:t>
       </w:r>
     </w:p>
-    <w:bookmarkStart w:id="94" w:name="X303769c0b63f3283938e5e709992a9f46145e86"/>
+    <w:bookmarkStart w:id="95" w:name="X303769c0b63f3283938e5e709992a9f46145e86"/>
     <w:p>
       <w:pPr>
         <w:pStyle w:val="Heading2"/>
@@ -5409,8 +5425,8 @@
         </w:tc>
       </w:tr>
     </w:tbl>
-    <w:bookmarkEnd w:id="94"/>
-    <w:bookmarkStart w:id="98" w:name="qui-peut-ouvrir-une-session-distante-q2"/>
+    <w:bookmarkEnd w:id="95"/>
+    <w:bookmarkStart w:id="99" w:name="qui-peut-ouvrir-une-session-distante-q2"/>
     <w:p>
       <w:pPr>
         <w:pStyle w:val="Heading2"/>
@@ -5537,18 +5553,18 @@
           <wp:inline>
             <wp:extent cx="5334000" cy="1245053"/>
             <wp:effectExtent b="0" l="0" r="0" t="0"/>
-            <wp:docPr descr="Droits de connexion distante sur PC01 et PC02" title="" id="96" name="Picture"/>
+            <wp:docPr descr="Droits de connexion distante sur PC01 et PC02" title="" id="97" name="Picture"/>
             <a:graphic>
               <a:graphicData uri="http://schemas.openxmlformats.org/drawingml/2006/picture">
                 <pic:pic>
                   <pic:nvPicPr>
-                    <pic:cNvPr descr="../screenshots/P7-2_qui-peut-se-connecter.jpg" id="97" name="Picture"/>
+                    <pic:cNvPr descr="../screenshots/P7-2_qui-peut-se-connecter.jpg" id="98" name="Picture"/>
                     <pic:cNvPicPr>
                       <a:picLocks noChangeArrowheads="1" noChangeAspect="1"/>
                     </pic:cNvPicPr>
                   </pic:nvPicPr>
                   <pic:blipFill>
-                    <a:blip r:embed="rId95"/>
+                    <a:blip r:embed="rId96"/>
                     <a:stretch>
                       <a:fillRect/>
                     </a:stretch>
@@ -5583,8 +5599,8 @@
         <w:t xml:space="preserve">Droits de connexion distante sur PC01 et PC02</w:t>
       </w:r>
     </w:p>
-    <w:bookmarkEnd w:id="98"/>
-    <w:bookmarkStart w:id="108" w:name="Xd7b24236bc058e1016d9d68d318b5ee363c81be"/>
+    <w:bookmarkEnd w:id="99"/>
+    <w:bookmarkStart w:id="109" w:name="Xd7b24236bc058e1016d9d68d318b5ee363c81be"/>
     <w:p>
       <w:pPr>
         <w:pStyle w:val="Heading2"/>
@@ -5771,18 +5787,18 @@
           <wp:inline>
             <wp:extent cx="5334000" cy="1551214"/>
             <wp:effectExtent b="0" l="0" r="0" t="0"/>
-            <wp:docPr descr="Compte svc-patch non administrateur" title="" id="100" name="Picture"/>
+            <wp:docPr descr="Compte svc-patch non administrateur" title="" id="101" name="Picture"/>
             <a:graphic>
               <a:graphicData uri="http://schemas.openxmlformats.org/drawingml/2006/picture">
                 <pic:pic>
                   <pic:nvPicPr>
-                    <pic:cNvPr descr="../screenshots/P7-3_compte-svc-patch-moindre-privilege.jpg" id="101" name="Picture"/>
+                    <pic:cNvPr descr="../screenshots/P7-3_compte-svc-patch-moindre-privilege.jpg" id="102" name="Picture"/>
                     <pic:cNvPicPr>
                       <a:picLocks noChangeArrowheads="1" noChangeAspect="1"/>
                     </pic:cNvPicPr>
                   </pic:nvPicPr>
                   <pic:blipFill>
-                    <a:blip r:embed="rId99"/>
+                    <a:blip r:embed="rId100"/>
                     <a:stretch>
                       <a:fillRect/>
                     </a:stretch>
@@ -5843,18 +5859,18 @@
           <wp:inline>
             <wp:extent cx="5334000" cy="2520723"/>
             <wp:effectExtent b="0" l="0" r="0" t="0"/>
-            <wp:docPr descr="Audit complet avec svc-patch via JEA" title="" id="103" name="Picture"/>
+            <wp:docPr descr="Audit complet avec svc-patch via JEA" title="" id="104" name="Picture"/>
             <a:graphic>
               <a:graphicData uri="http://schemas.openxmlformats.org/drawingml/2006/picture">
                 <pic:pic>
                   <pic:nvPicPr>
-                    <pic:cNvPr descr="../screenshots/P7-3b_audit-complet-svc-patch-JEA.jpg" id="104" name="Picture"/>
+                    <pic:cNvPr descr="../screenshots/P7-3b_audit-complet-svc-patch-JEA.jpg" id="105" name="Picture"/>
                     <pic:cNvPicPr>
                       <a:picLocks noChangeArrowheads="1" noChangeAspect="1"/>
                     </pic:cNvPicPr>
                   </pic:nvPicPr>
                   <pic:blipFill>
-                    <a:blip r:embed="rId102"/>
+                    <a:blip r:embed="rId103"/>
                     <a:stretch>
                       <a:fillRect/>
                     </a:stretch>
@@ -5906,18 +5922,18 @@
           <wp:inline>
             <wp:extent cx="5334000" cy="544362"/>
             <wp:effectExtent b="0" l="0" r="0" t="0"/>
-            <wp:docPr descr="Credential chiffré DPAPI" title="" id="106" name="Picture"/>
+            <wp:docPr descr="Credential chiffré DPAPI" title="" id="107" name="Picture"/>
             <a:graphic>
               <a:graphicData uri="http://schemas.openxmlformats.org/drawingml/2006/picture">
                 <pic:pic>
                   <pic:nvPicPr>
-                    <pic:cNvPr descr="../screenshots/P7_credential-chiffre-DPAPI.jpg" id="107" name="Picture"/>
+                    <pic:cNvPr descr="../screenshots/P7_credential-chiffre-DPAPI.jpg" id="108" name="Picture"/>
                     <pic:cNvPicPr>
                       <a:picLocks noChangeArrowheads="1" noChangeAspect="1"/>
                     </pic:cNvPicPr>
                   </pic:nvPicPr>
                   <pic:blipFill>
-                    <a:blip r:embed="rId105"/>
+                    <a:blip r:embed="rId106"/>
                     <a:stretch>
                       <a:fillRect/>
                     </a:stretch>
@@ -5952,8 +5968,8 @@
         <w:t xml:space="preserve">Credential chiffré DPAPI</w:t>
       </w:r>
     </w:p>
-    <w:bookmarkEnd w:id="108"/>
-    <w:bookmarkStart w:id="112" w:name="protection-des-fichiers-produits-q4"/>
+    <w:bookmarkEnd w:id="109"/>
+    <w:bookmarkStart w:id="113" w:name="protection-des-fichiers-produits-q4"/>
     <w:p>
       <w:pPr>
         <w:pStyle w:val="Heading2"/>
@@ -6099,18 +6115,18 @@
           <wp:inline>
             <wp:extent cx="5334000" cy="2520723"/>
             <wp:effectExtent b="0" l="0" r="0" t="0"/>
-            <wp:docPr descr="ACL avant / après" title="" id="110" name="Picture"/>
+            <wp:docPr descr="ACL avant / après" title="" id="111" name="Picture"/>
             <a:graphic>
               <a:graphicData uri="http://schemas.openxmlformats.org/drawingml/2006/picture">
                 <pic:pic>
                   <pic:nvPicPr>
-                    <pic:cNvPr descr="../screenshots/P7-4_ACL-fichiers.jpg" id="111" name="Picture"/>
+                    <pic:cNvPr descr="../screenshots/P7-4_ACL-fichiers.jpg" id="112" name="Picture"/>
                     <pic:cNvPicPr>
                       <a:picLocks noChangeArrowheads="1" noChangeAspect="1"/>
                     </pic:cNvPicPr>
                   </pic:nvPicPr>
                   <pic:blipFill>
-                    <a:blip r:embed="rId109"/>
+                    <a:blip r:embed="rId110"/>
                     <a:stretch>
                       <a:fillRect/>
                     </a:stretch>
@@ -6195,8 +6211,8 @@
         <w:t xml:space="preserve">).</w:t>
       </w:r>
     </w:p>
-    <w:bookmarkEnd w:id="112"/>
-    <w:bookmarkStart w:id="116" w:name="pare-feu-winrm-q5"/>
+    <w:bookmarkEnd w:id="113"/>
+    <w:bookmarkStart w:id="117" w:name="pare-feu-winrm-q5"/>
     <w:p>
       <w:pPr>
         <w:pStyle w:val="Heading2"/>
@@ -6304,18 +6320,18 @@
           <wp:inline>
             <wp:extent cx="5334000" cy="2520723"/>
             <wp:effectExtent b="0" l="0" r="0" t="0"/>
-            <wp:docPr descr="Règles de pare-feu WinRM avant / après et vérification" title="" id="114" name="Picture"/>
+            <wp:docPr descr="Règles de pare-feu WinRM avant / après et vérification" title="" id="115" name="Picture"/>
             <a:graphic>
               <a:graphicData uri="http://schemas.openxmlformats.org/drawingml/2006/picture">
                 <pic:pic>
                   <pic:nvPicPr>
-                    <pic:cNvPr descr="../screenshots/P7-5_pare-feu-WinRM.jpg" id="115" name="Picture"/>
+                    <pic:cNvPr descr="../screenshots/P7-5_pare-feu-WinRM.jpg" id="116" name="Picture"/>
                     <pic:cNvPicPr>
                       <a:picLocks noChangeArrowheads="1" noChangeAspect="1"/>
                     </pic:cNvPicPr>
                   </pic:nvPicPr>
                   <pic:blipFill>
-                    <a:blip r:embed="rId113"/>
+                    <a:blip r:embed="rId114"/>
                     <a:stretch>
                       <a:fillRect/>
                     </a:stretch>
@@ -6399,8 +6415,8 @@
         <w:t xml:space="preserve">d’une mesure de sécurité, pas seulement l’appliquer.</w:t>
       </w:r>
     </w:p>
-    <w:bookmarkEnd w:id="116"/>
-    <w:bookmarkStart w:id="123" w:name="X326bd7ac1eb7066dfde915091867af039064a1e"/>
+    <w:bookmarkEnd w:id="117"/>
+    <w:bookmarkStart w:id="124" w:name="X326bd7ac1eb7066dfde915091867af039064a1e"/>
     <w:p>
       <w:pPr>
         <w:pStyle w:val="Heading2"/>
@@ -6519,18 +6535,18 @@
           <wp:inline>
             <wp:extent cx="5334000" cy="3007701"/>
             <wp:effectExtent b="0" l="0" r="0" t="0"/>
-            <wp:docPr descr="Méthodes d’authentification et protocole réellement utilisé" title="" id="118" name="Picture"/>
+            <wp:docPr descr="Méthodes d’authentification et protocole réellement utilisé" title="" id="119" name="Picture"/>
             <a:graphic>
               <a:graphicData uri="http://schemas.openxmlformats.org/drawingml/2006/picture">
                 <pic:pic>
                   <pic:nvPicPr>
-                    <pic:cNvPr descr="../screenshots/P7-6_authentification-NTLM.jpg" id="119" name="Picture"/>
+                    <pic:cNvPr descr="../screenshots/P7-6_authentification-NTLM.jpg" id="120" name="Picture"/>
                     <pic:cNvPicPr>
                       <a:picLocks noChangeArrowheads="1" noChangeAspect="1"/>
                     </pic:cNvPicPr>
                   </pic:nvPicPr>
                   <pic:blipFill>
-                    <a:blip r:embed="rId117"/>
+                    <a:blip r:embed="rId118"/>
                     <a:stretch>
                       <a:fillRect/>
                     </a:stretch>
@@ -6614,18 +6630,18 @@
           <wp:inline>
             <wp:extent cx="5334000" cy="2037669"/>
             <wp:effectExtent b="0" l="0" r="0" t="0"/>
-            <wp:docPr descr="Durcissement du client WinRM" title="" id="121" name="Picture"/>
+            <wp:docPr descr="Durcissement du client WinRM" title="" id="122" name="Picture"/>
             <a:graphic>
               <a:graphicData uri="http://schemas.openxmlformats.org/drawingml/2006/picture">
                 <pic:pic>
                   <pic:nvPicPr>
-                    <pic:cNvPr descr="../screenshots/P7-6b_durcissement-client-WinRM.jpg" id="122" name="Picture"/>
+                    <pic:cNvPr descr="../screenshots/P7-6b_durcissement-client-WinRM.jpg" id="123" name="Picture"/>
                     <pic:cNvPicPr>
                       <a:picLocks noChangeArrowheads="1" noChangeAspect="1"/>
                     </pic:cNvPicPr>
                   </pic:nvPicPr>
                   <pic:blipFill>
-                    <a:blip r:embed="rId120"/>
+                    <a:blip r:embed="rId121"/>
                     <a:stretch>
                       <a:fillRect/>
                     </a:stretch>
@@ -6766,8 +6782,8 @@
         <w:t xml:space="preserve">explicite et des mots de passe locaux uniques (LAPS).</w:t>
       </w:r>
     </w:p>
-    <w:bookmarkEnd w:id="123"/>
-    <w:bookmarkStart w:id="127" w:name="just-enough-administration-q7"/>
+    <w:bookmarkEnd w:id="124"/>
+    <w:bookmarkStart w:id="128" w:name="just-enough-administration-q7"/>
     <w:p>
       <w:pPr>
         <w:pStyle w:val="Heading2"/>
@@ -7099,18 +7115,18 @@
           <wp:inline>
             <wp:extent cx="5334000" cy="3007701"/>
             <wp:effectExtent b="0" l="0" r="0" t="0"/>
-            <wp:docPr descr="Point de terminaison JEA PatchAudit" title="" id="125" name="Picture"/>
+            <wp:docPr descr="Point de terminaison JEA PatchAudit" title="" id="126" name="Picture"/>
             <a:graphic>
               <a:graphicData uri="http://schemas.openxmlformats.org/drawingml/2006/picture">
                 <pic:pic>
                   <pic:nvPicPr>
-                    <pic:cNvPr descr="../screenshots/P7-7_JEA-PatchAudit.jpg" id="126" name="Picture"/>
+                    <pic:cNvPr descr="../screenshots/P7-7_JEA-PatchAudit.jpg" id="127" name="Picture"/>
                     <pic:cNvPicPr>
                       <a:picLocks noChangeArrowheads="1" noChangeAspect="1"/>
                     </pic:cNvPicPr>
                   </pic:nvPicPr>
                   <pic:blipFill>
-                    <a:blip r:embed="rId124"/>
+                    <a:blip r:embed="rId125"/>
                     <a:stretch>
                       <a:fillRect/>
                     </a:stretch>
@@ -7145,8 +7161,8 @@
         <w:t xml:space="preserve">Point de terminaison JEA PatchAudit</w:t>
       </w:r>
     </w:p>
-    <w:bookmarkEnd w:id="127"/>
-    <w:bookmarkStart w:id="128" w:name="Xa5007d34547534aeb13eaa27ecf966de56fe557"/>
+    <w:bookmarkEnd w:id="128"/>
+    <w:bookmarkStart w:id="129" w:name="Xa5007d34547534aeb13eaa27ecf966de56fe557"/>
     <w:p>
       <w:pPr>
         <w:pStyle w:val="Heading2"/>
@@ -7416,9 +7432,9 @@
         <w:t xml:space="preserve">par stratégie de groupe) garde une trace de toutes les commandes exécutées sur les postes.</w:t>
       </w:r>
     </w:p>
-    <w:bookmarkEnd w:id="128"/>
     <w:bookmarkEnd w:id="129"/>
-    <w:bookmarkStart w:id="130" w:name="tests-réalisés-et-résultats"/>
+    <w:bookmarkEnd w:id="130"/>
+    <w:bookmarkStart w:id="131" w:name="tests-réalisés-et-résultats"/>
     <w:p>
       <w:pPr>
         <w:pStyle w:val="Heading1"/>
@@ -7924,8 +7940,8 @@
         <w:t xml:space="preserve">. Action à mener : terminer l’installation de KB5128942 sur PC01 (puis redémarrer) et vérifier PC03.</w:t>
       </w:r>
     </w:p>
-    <w:bookmarkEnd w:id="130"/>
-    <w:bookmarkStart w:id="131" w:name="limites-et-améliorations-possibles"/>
+    <w:bookmarkEnd w:id="131"/>
+    <w:bookmarkStart w:id="132" w:name="limites-et-améliorations-possibles"/>
     <w:p>
       <w:pPr>
         <w:pStyle w:val="Heading1"/>
@@ -8145,8 +8161,8 @@
         <w:t xml:space="preserve">WinRM en HTTPS avec certificats et planification de l’audit (tâche planifiée sous le compte de service) seraient les prochaines étapes vers une utilisation en production.</w:t>
       </w:r>
     </w:p>
-    <w:bookmarkEnd w:id="131"/>
-    <w:bookmarkStart w:id="132" w:name="conclusion"/>
+    <w:bookmarkEnd w:id="132"/>
+    <w:bookmarkStart w:id="133" w:name="conclusion"/>
     <w:p>
       <w:pPr>
         <w:pStyle w:val="Heading1"/>
@@ -8187,8 +8203,8 @@
         <w:t xml:space="preserve">après application.</w:t>
       </w:r>
     </w:p>
-    <w:bookmarkEnd w:id="132"/>
-    <w:bookmarkStart w:id="133" w:name="annexe-utilisation"/>
+    <w:bookmarkEnd w:id="133"/>
+    <w:bookmarkStart w:id="134" w:name="annexe-utilisation"/>
     <w:p>
       <w:pPr>
         <w:pStyle w:val="Heading1"/>
@@ -8289,7 +8305,7 @@
         <w:t xml:space="preserve">.\PatchManager.ps1</w:t>
       </w:r>
     </w:p>
-    <w:bookmarkEnd w:id="133"/>
+    <w:bookmarkEnd w:id="134"/>
     <w:sectPr>
       <w:footerReference xmlns:r="http://schemas.openxmlformats.org/officeDocument/2006/relationships" r:id="rIdFooterPM" w:type="default"/>
       <w:titlePg/>

</xml_diff>